<commit_message>
kubernetes - kubctl updated
</commit_message>
<xml_diff>
--- a/Kubernetes/4-kubectl.docx
+++ b/Kubernetes/4-kubectl.docx
@@ -54,6 +54,7 @@
     </w:p>
     <w:p>
       <w:pPr>
+        <w:spacing w:after="60"/>
         <w:jc w:val="both"/>
         <w:rPr>
           <w:rFonts w:asciiTheme="majorBidi" w:hAnsiTheme="majorBidi" w:cstheme="majorBidi"/>
@@ -110,6 +111,7 @@
     </w:p>
     <w:p>
       <w:pPr>
+        <w:spacing w:after="120"/>
         <w:jc w:val="both"/>
         <w:rPr>
           <w:rFonts w:asciiTheme="majorBidi" w:hAnsiTheme="majorBidi" w:cstheme="majorBidi"/>
@@ -8988,15 +8990,7 @@
           <w:sz w:val="28"/>
           <w:szCs w:val="28"/>
         </w:rPr>
-        <w:t xml:space="preserve"> </w:t>
-      </w:r>
-      <w:r>
-        <w:rPr>
-          <w:rFonts w:asciiTheme="majorBidi" w:hAnsiTheme="majorBidi" w:cstheme="majorBidi"/>
-          <w:sz w:val="28"/>
-          <w:szCs w:val="28"/>
-        </w:rPr>
-        <w:t xml:space="preserve">→ </w:t>
+        <w:t xml:space="preserve"> → </w:t>
       </w:r>
       <w:r>
         <w:rPr>
@@ -9109,23 +9103,7 @@
           <w:sz w:val="28"/>
           <w:szCs w:val="28"/>
         </w:rPr>
-        <w:t xml:space="preserve"> </w:t>
-      </w:r>
-      <w:r>
-        <w:rPr>
-          <w:rFonts w:asciiTheme="majorBidi" w:hAnsiTheme="majorBidi" w:cstheme="majorBidi"/>
-          <w:sz w:val="28"/>
-          <w:szCs w:val="28"/>
-        </w:rPr>
-        <w:t>→</w:t>
-      </w:r>
-      <w:r>
-        <w:rPr>
-          <w:rFonts w:asciiTheme="majorBidi" w:hAnsiTheme="majorBidi" w:cstheme="majorBidi"/>
-          <w:sz w:val="28"/>
-          <w:szCs w:val="28"/>
-        </w:rPr>
-        <w:t xml:space="preserve"> </w:t>
+        <w:t xml:space="preserve"> → </w:t>
       </w:r>
       <w:r>
         <w:rPr>
@@ -9183,15 +9161,7 @@
           <w:sz w:val="28"/>
           <w:szCs w:val="28"/>
         </w:rPr>
-        <w:t xml:space="preserve"> </w:t>
-      </w:r>
-      <w:r>
-        <w:rPr>
-          <w:rFonts w:asciiTheme="majorBidi" w:hAnsiTheme="majorBidi" w:cstheme="majorBidi"/>
-          <w:sz w:val="28"/>
-          <w:szCs w:val="28"/>
-        </w:rPr>
-        <w:t xml:space="preserve">→ </w:t>
+        <w:t xml:space="preserve"> → </w:t>
       </w:r>
       <w:r>
         <w:rPr>
@@ -9299,15 +9269,7 @@
           <w:sz w:val="28"/>
           <w:szCs w:val="28"/>
         </w:rPr>
-        <w:t xml:space="preserve"> </w:t>
-      </w:r>
-      <w:r>
-        <w:rPr>
-          <w:rFonts w:asciiTheme="majorBidi" w:hAnsiTheme="majorBidi" w:cstheme="majorBidi"/>
-          <w:sz w:val="28"/>
-          <w:szCs w:val="28"/>
-        </w:rPr>
-        <w:t xml:space="preserve">→ </w:t>
+        <w:t xml:space="preserve"> → </w:t>
       </w:r>
       <w:r>
         <w:rPr>
@@ -9909,6 +9871,7 @@
     </w:p>
     <w:p>
       <w:pPr>
+        <w:spacing w:after="60"/>
         <w:jc w:val="both"/>
         <w:rPr>
           <w:rFonts w:asciiTheme="majorBidi" w:hAnsiTheme="majorBidi" w:cstheme="majorBidi"/>
@@ -9941,17 +9904,22 @@
     </w:p>
     <w:p>
       <w:pPr>
-        <w:jc w:val="both"/>
-        <w:rPr>
-          <w:rFonts w:asciiTheme="majorBidi" w:hAnsiTheme="majorBidi" w:cstheme="majorBidi"/>
-          <w:sz w:val="28"/>
-          <w:szCs w:val="28"/>
-        </w:rPr>
-      </w:pPr>
-      <w:proofErr w:type="spellStart"/>
-      <w:r>
-        <w:rPr>
-          <w:rFonts w:asciiTheme="majorBidi" w:hAnsiTheme="majorBidi" w:cstheme="majorBidi"/>
+        <w:spacing w:after="60"/>
+        <w:jc w:val="both"/>
+        <w:rPr>
+          <w:rFonts w:asciiTheme="majorBidi" w:hAnsiTheme="majorBidi" w:cstheme="majorBidi"/>
+          <w:sz w:val="28"/>
+          <w:szCs w:val="28"/>
+        </w:rPr>
+      </w:pPr>
+      <w:proofErr w:type="spellStart"/>
+      <w:r>
+        <w:rPr>
+          <w:rFonts w:asciiTheme="majorBidi" w:hAnsiTheme="majorBidi" w:cstheme="majorBidi"/>
+          <w:b/>
+          <w:bCs/>
+          <w:i/>
+          <w:iCs/>
           <w:sz w:val="28"/>
           <w:szCs w:val="28"/>
         </w:rPr>
@@ -9961,10 +9929,22 @@
       <w:r>
         <w:rPr>
           <w:rFonts w:asciiTheme="majorBidi" w:hAnsiTheme="majorBidi" w:cstheme="majorBidi"/>
-          <w:sz w:val="28"/>
-          <w:szCs w:val="28"/>
-        </w:rPr>
-        <w:t xml:space="preserve"> apply is considered a declarative command because the user specifies the desired configuration rather than issuing individual instructions. Kubernetes then automatically determines the actions needed to reach that desired state.</w:t>
+          <w:b/>
+          <w:bCs/>
+          <w:i/>
+          <w:iCs/>
+          <w:sz w:val="28"/>
+          <w:szCs w:val="28"/>
+        </w:rPr>
+        <w:t xml:space="preserve"> apply</w:t>
+      </w:r>
+      <w:r>
+        <w:rPr>
+          <w:rFonts w:asciiTheme="majorBidi" w:hAnsiTheme="majorBidi" w:cstheme="majorBidi"/>
+          <w:sz w:val="28"/>
+          <w:szCs w:val="28"/>
+        </w:rPr>
+        <w:t xml:space="preserve"> is considered a declarative command because the user specifies the desired configuration rather than issuing individual instructions. Kubernetes then automatically determines the actions needed to reach that desired state.</w:t>
       </w:r>
     </w:p>
     <w:p>
@@ -10038,6 +10018,7 @@
     </w:p>
     <w:p>
       <w:pPr>
+        <w:spacing w:after="60"/>
         <w:jc w:val="both"/>
         <w:rPr>
           <w:rFonts w:asciiTheme="majorBidi" w:hAnsiTheme="majorBidi" w:cstheme="majorBidi"/>
@@ -10081,6 +10062,10 @@
       <w:r>
         <w:rPr>
           <w:rFonts w:asciiTheme="majorBidi" w:hAnsiTheme="majorBidi" w:cstheme="majorBidi"/>
+          <w:b/>
+          <w:bCs/>
+          <w:i/>
+          <w:iCs/>
           <w:sz w:val="28"/>
           <w:szCs w:val="28"/>
         </w:rPr>
@@ -10090,14 +10075,27 @@
       <w:r>
         <w:rPr>
           <w:rFonts w:asciiTheme="majorBidi" w:hAnsiTheme="majorBidi" w:cstheme="majorBidi"/>
-          <w:sz w:val="28"/>
-          <w:szCs w:val="28"/>
-        </w:rPr>
-        <w:t xml:space="preserve"> apply is widely used in Kubernetes environments because it supports infrastructure as code practices. Configuration files can be stored in version control systems such as Git, making it easier to track changes, collaborate with teams, and maintain consistent deployments across environments.</w:t>
-      </w:r>
-    </w:p>
-    <w:p>
-      <w:pPr>
+          <w:b/>
+          <w:bCs/>
+          <w:i/>
+          <w:iCs/>
+          <w:sz w:val="28"/>
+          <w:szCs w:val="28"/>
+        </w:rPr>
+        <w:t xml:space="preserve"> apply</w:t>
+      </w:r>
+      <w:r>
+        <w:rPr>
+          <w:rFonts w:asciiTheme="majorBidi" w:hAnsiTheme="majorBidi" w:cstheme="majorBidi"/>
+          <w:sz w:val="28"/>
+          <w:szCs w:val="28"/>
+        </w:rPr>
+        <w:t xml:space="preserve"> is widely used in Kubernetes environments because it supports infrastructure as code practices. Configuration files can be stored in version control systems such as Git, making it easier to track changes, collaborate with teams, and maintain consistent deployments across environments.</w:t>
+      </w:r>
+    </w:p>
+    <w:p>
+      <w:pPr>
+        <w:spacing w:after="120"/>
         <w:jc w:val="both"/>
         <w:rPr>
           <w:rFonts w:asciiTheme="majorBidi" w:hAnsiTheme="majorBidi" w:cstheme="majorBidi"/>
@@ -10120,6 +10118,7 @@
     </w:p>
     <w:p>
       <w:pPr>
+        <w:spacing w:after="60"/>
         <w:jc w:val="both"/>
         <w:rPr>
           <w:rFonts w:asciiTheme="majorBidi" w:hAnsiTheme="majorBidi" w:cstheme="majorBidi"/>
@@ -10182,6 +10181,7 @@
     </w:p>
     <w:p>
       <w:pPr>
+        <w:spacing w:after="120"/>
         <w:jc w:val="both"/>
         <w:rPr>
           <w:rFonts w:asciiTheme="majorBidi" w:hAnsiTheme="majorBidi" w:cstheme="majorBidi"/>
@@ -10264,6 +10264,7 @@
     </w:p>
     <w:p>
       <w:pPr>
+        <w:spacing w:after="60"/>
         <w:jc w:val="both"/>
         <w:rPr>
           <w:rFonts w:asciiTheme="majorBidi" w:hAnsiTheme="majorBidi" w:cstheme="majorBidi"/>
@@ -10336,6 +10337,7 @@
     </w:p>
     <w:p>
       <w:pPr>
+        <w:spacing w:after="60"/>
         <w:jc w:val="both"/>
         <w:rPr>
           <w:rFonts w:asciiTheme="majorBidi" w:hAnsiTheme="majorBidi" w:cstheme="majorBidi"/>
@@ -10635,7 +10637,6 @@
           <w:sz w:val="28"/>
           <w:szCs w:val="28"/>
         </w:rPr>
-        <w:lastRenderedPageBreak/>
         <w:t xml:space="preserve">If the update is valid, the changes are applied immediately. If there are validation errors, </w:t>
       </w:r>
       <w:proofErr w:type="spellStart"/>
@@ -10663,6 +10664,7 @@
     </w:p>
     <w:p>
       <w:pPr>
+        <w:spacing w:after="60"/>
         <w:jc w:val="both"/>
         <w:rPr>
           <w:rFonts w:asciiTheme="majorBidi" w:hAnsiTheme="majorBidi" w:cstheme="majorBidi"/>
@@ -10680,6 +10682,7 @@
           <w:sz w:val="32"/>
           <w:szCs w:val="32"/>
         </w:rPr>
+        <w:lastRenderedPageBreak/>
         <w:t>Default Editor</w:t>
       </w:r>
       <w:r>
@@ -10695,6 +10698,7 @@
     </w:p>
     <w:p>
       <w:pPr>
+        <w:spacing w:after="120"/>
         <w:jc w:val="both"/>
         <w:rPr>
           <w:rFonts w:asciiTheme="majorBidi" w:hAnsiTheme="majorBidi" w:cstheme="majorBidi"/>
@@ -10828,6 +10832,10 @@
       <w:r>
         <w:rPr>
           <w:rFonts w:asciiTheme="majorBidi" w:hAnsiTheme="majorBidi" w:cstheme="majorBidi"/>
+          <w:b/>
+          <w:bCs/>
+          <w:i/>
+          <w:iCs/>
           <w:sz w:val="28"/>
           <w:szCs w:val="28"/>
         </w:rPr>
@@ -10837,10 +10845,22 @@
       <w:r>
         <w:rPr>
           <w:rFonts w:asciiTheme="majorBidi" w:hAnsiTheme="majorBidi" w:cstheme="majorBidi"/>
-          <w:sz w:val="28"/>
-          <w:szCs w:val="28"/>
-        </w:rPr>
-        <w:t xml:space="preserve"> edit is commonly used for quick adjustments to running resources, debugging configurations, or testing small changes. However, for production environments and version-controlled infrastructure, it is generally recommended to modify YAML manifest files and apply them using declarative methods such as </w:t>
+          <w:b/>
+          <w:bCs/>
+          <w:i/>
+          <w:iCs/>
+          <w:sz w:val="28"/>
+          <w:szCs w:val="28"/>
+        </w:rPr>
+        <w:t xml:space="preserve"> edit</w:t>
+      </w:r>
+      <w:r>
+        <w:rPr>
+          <w:rFonts w:asciiTheme="majorBidi" w:hAnsiTheme="majorBidi" w:cstheme="majorBidi"/>
+          <w:sz w:val="28"/>
+          <w:szCs w:val="28"/>
+        </w:rPr>
+        <w:t xml:space="preserve"> is commonly used for quick adjustments to running resources, debugging configurations, or testing small changes. However, for production environments and version-controlled infrastructure, it is generally recommended to modify YAML manifest files and apply them using declarative methods such as </w:t>
       </w:r>
       <w:proofErr w:type="spellStart"/>
       <w:r>
@@ -10879,6 +10899,7 @@
     </w:p>
     <w:p>
       <w:pPr>
+        <w:spacing w:after="120"/>
         <w:jc w:val="both"/>
         <w:rPr>
           <w:rFonts w:asciiTheme="majorBidi" w:hAnsiTheme="majorBidi" w:cstheme="majorBidi"/>
@@ -10901,6 +10922,7 @@
     </w:p>
     <w:p>
       <w:pPr>
+        <w:spacing w:after="60"/>
         <w:jc w:val="both"/>
         <w:rPr>
           <w:rFonts w:asciiTheme="majorBidi" w:hAnsiTheme="majorBidi" w:cstheme="majorBidi"/>
@@ -11092,6 +11114,7 @@
     </w:p>
     <w:p>
       <w:pPr>
+        <w:spacing w:after="60"/>
         <w:jc w:val="both"/>
         <w:rPr>
           <w:rFonts w:asciiTheme="majorBidi" w:hAnsiTheme="majorBidi" w:cstheme="majorBidi"/>
@@ -11114,6 +11137,7 @@
     </w:p>
     <w:p>
       <w:pPr>
+        <w:spacing w:after="120"/>
         <w:jc w:val="both"/>
         <w:rPr>
           <w:rFonts w:asciiTheme="majorBidi" w:hAnsiTheme="majorBidi" w:cstheme="majorBidi"/>
@@ -11154,28 +11178,23 @@
     </w:p>
     <w:p>
       <w:pPr>
-        <w:jc w:val="both"/>
-        <w:rPr>
-          <w:rFonts w:asciiTheme="majorBidi" w:hAnsiTheme="majorBidi" w:cstheme="majorBidi"/>
-          <w:sz w:val="28"/>
-          <w:szCs w:val="28"/>
-        </w:rPr>
-      </w:pPr>
-      <w:r>
-        <w:rPr>
-          <w:rFonts w:asciiTheme="majorBidi" w:hAnsiTheme="majorBidi" w:cstheme="majorBidi"/>
-          <w:sz w:val="28"/>
-          <w:szCs w:val="28"/>
-        </w:rPr>
-        <w:t>Example</w:t>
-      </w:r>
-      <w:r>
-        <w:rPr>
-          <w:rFonts w:asciiTheme="majorBidi" w:hAnsiTheme="majorBidi" w:cstheme="majorBidi"/>
-          <w:sz w:val="28"/>
-          <w:szCs w:val="28"/>
-        </w:rPr>
-        <w:t>:</w:t>
+        <w:spacing w:after="60"/>
+        <w:jc w:val="both"/>
+        <w:rPr>
+          <w:rFonts w:asciiTheme="majorBidi" w:hAnsiTheme="majorBidi" w:cstheme="majorBidi"/>
+          <w:sz w:val="28"/>
+          <w:szCs w:val="28"/>
+          <w:u w:val="single"/>
+        </w:rPr>
+      </w:pPr>
+      <w:r>
+        <w:rPr>
+          <w:rFonts w:asciiTheme="majorBidi" w:hAnsiTheme="majorBidi" w:cstheme="majorBidi"/>
+          <w:sz w:val="28"/>
+          <w:szCs w:val="28"/>
+          <w:u w:val="single"/>
+        </w:rPr>
+        <w:t>Example:</w:t>
       </w:r>
     </w:p>
     <w:p>
@@ -11541,6 +11560,7 @@
           <w:ilvl w:val="0"/>
           <w:numId w:val="26"/>
         </w:numPr>
+        <w:spacing w:after="120"/>
         <w:ind w:left="360"/>
         <w:jc w:val="both"/>
         <w:rPr>
@@ -11614,6 +11634,7 @@
     </w:p>
     <w:p>
       <w:pPr>
+        <w:spacing w:after="60"/>
         <w:jc w:val="both"/>
       </w:pPr>
       <w:proofErr w:type="spellStart"/>
@@ -11684,46 +11705,46 @@
           <w:sz w:val="28"/>
           <w:szCs w:val="28"/>
         </w:rPr>
+        <w:t>kubectl</w:t>
+      </w:r>
+      <w:proofErr w:type="spellEnd"/>
+      <w:r>
+        <w:rPr>
+          <w:rFonts w:asciiTheme="majorBidi" w:hAnsiTheme="majorBidi" w:cstheme="majorBidi"/>
+          <w:b/>
+          <w:bCs/>
+          <w:i/>
+          <w:iCs/>
+          <w:sz w:val="28"/>
+          <w:szCs w:val="28"/>
+        </w:rPr>
+        <w:t xml:space="preserve"> exec</w:t>
+      </w:r>
+      <w:r>
+        <w:rPr>
+          <w:rFonts w:asciiTheme="majorBidi" w:hAnsiTheme="majorBidi" w:cstheme="majorBidi"/>
+          <w:sz w:val="28"/>
+          <w:szCs w:val="28"/>
+        </w:rPr>
+        <w:t xml:space="preserve"> is a command used to run a command inside a container of a running Pod. It allows administrators and developers to interact directly with containers for debugging, inspection, and troubleshooting purposes without modifying the Pod configuration or rebuilding images.</w:t>
+      </w:r>
+    </w:p>
+    <w:p>
+      <w:pPr>
+        <w:jc w:val="both"/>
+        <w:rPr>
+          <w:rFonts w:asciiTheme="majorBidi" w:hAnsiTheme="majorBidi" w:cstheme="majorBidi"/>
+          <w:sz w:val="28"/>
+          <w:szCs w:val="28"/>
+        </w:rPr>
+      </w:pPr>
+      <w:r>
+        <w:rPr>
+          <w:rFonts w:asciiTheme="majorBidi" w:hAnsiTheme="majorBidi" w:cstheme="majorBidi"/>
+          <w:sz w:val="28"/>
+          <w:szCs w:val="28"/>
+        </w:rPr>
         <w:lastRenderedPageBreak/>
-        <w:t>kubectl</w:t>
-      </w:r>
-      <w:proofErr w:type="spellEnd"/>
-      <w:r>
-        <w:rPr>
-          <w:rFonts w:asciiTheme="majorBidi" w:hAnsiTheme="majorBidi" w:cstheme="majorBidi"/>
-          <w:b/>
-          <w:bCs/>
-          <w:i/>
-          <w:iCs/>
-          <w:sz w:val="28"/>
-          <w:szCs w:val="28"/>
-        </w:rPr>
-        <w:t xml:space="preserve"> exec</w:t>
-      </w:r>
-      <w:r>
-        <w:rPr>
-          <w:rFonts w:asciiTheme="majorBidi" w:hAnsiTheme="majorBidi" w:cstheme="majorBidi"/>
-          <w:sz w:val="28"/>
-          <w:szCs w:val="28"/>
-        </w:rPr>
-        <w:t xml:space="preserve"> is a command used to run a command inside a container of a running Pod. It allows administrators and developers to interact directly with containers for debugging, inspection, and troubleshooting purposes without modifying the Pod configuration or rebuilding images.</w:t>
-      </w:r>
-    </w:p>
-    <w:p>
-      <w:pPr>
-        <w:jc w:val="both"/>
-        <w:rPr>
-          <w:rFonts w:asciiTheme="majorBidi" w:hAnsiTheme="majorBidi" w:cstheme="majorBidi"/>
-          <w:sz w:val="28"/>
-          <w:szCs w:val="28"/>
-        </w:rPr>
-      </w:pPr>
-      <w:r>
-        <w:rPr>
-          <w:rFonts w:asciiTheme="majorBidi" w:hAnsiTheme="majorBidi" w:cstheme="majorBidi"/>
-          <w:sz w:val="28"/>
-          <w:szCs w:val="28"/>
-        </w:rPr>
         <w:t xml:space="preserve">When </w:t>
       </w:r>
       <w:proofErr w:type="spellStart"/>
@@ -11980,6 +12001,10 @@
       <w:r>
         <w:rPr>
           <w:rFonts w:asciiTheme="majorBidi" w:hAnsiTheme="majorBidi" w:cstheme="majorBidi"/>
+          <w:b/>
+          <w:bCs/>
+          <w:i/>
+          <w:iCs/>
           <w:sz w:val="28"/>
           <w:szCs w:val="28"/>
         </w:rPr>
@@ -11989,6 +12014,10 @@
       <w:r>
         <w:rPr>
           <w:rFonts w:asciiTheme="majorBidi" w:hAnsiTheme="majorBidi" w:cstheme="majorBidi"/>
+          <w:b/>
+          <w:bCs/>
+          <w:i/>
+          <w:iCs/>
           <w:sz w:val="28"/>
           <w:szCs w:val="28"/>
         </w:rPr>
@@ -11998,6 +12027,10 @@
       <w:r>
         <w:rPr>
           <w:rFonts w:asciiTheme="majorBidi" w:hAnsiTheme="majorBidi" w:cstheme="majorBidi"/>
+          <w:b/>
+          <w:bCs/>
+          <w:i/>
+          <w:iCs/>
           <w:sz w:val="28"/>
           <w:szCs w:val="28"/>
         </w:rPr>
@@ -12242,6 +12275,10 @@
       <w:r>
         <w:rPr>
           <w:rFonts w:asciiTheme="majorBidi" w:hAnsiTheme="majorBidi" w:cstheme="majorBidi"/>
+          <w:b/>
+          <w:bCs/>
+          <w:i/>
+          <w:iCs/>
           <w:sz w:val="28"/>
           <w:szCs w:val="28"/>
         </w:rPr>
@@ -12251,10 +12288,34 @@
       <w:r>
         <w:rPr>
           <w:rFonts w:asciiTheme="majorBidi" w:hAnsiTheme="majorBidi" w:cstheme="majorBidi"/>
-          <w:sz w:val="28"/>
-          <w:szCs w:val="28"/>
-        </w:rPr>
-        <w:t xml:space="preserve"> exec -it nginx-pod -n production -- env</w:t>
+          <w:b/>
+          <w:bCs/>
+          <w:i/>
+          <w:iCs/>
+          <w:sz w:val="28"/>
+          <w:szCs w:val="28"/>
+        </w:rPr>
+        <w:t xml:space="preserve"> exec -it nginx-pod -n production --</w:t>
+      </w:r>
+      <w:r>
+        <w:rPr>
+          <w:rFonts w:asciiTheme="majorBidi" w:hAnsiTheme="majorBidi" w:cstheme="majorBidi"/>
+          <w:sz w:val="28"/>
+          <w:szCs w:val="28"/>
+        </w:rPr>
+        <w:t xml:space="preserve"> </w:t>
+      </w:r>
+      <w:r>
+        <w:rPr>
+          <w:rFonts w:asciiTheme="majorBidi" w:hAnsiTheme="majorBidi" w:cstheme="majorBidi"/>
+          <w:b/>
+          <w:bCs/>
+          <w:i/>
+          <w:iCs/>
+          <w:sz w:val="28"/>
+          <w:szCs w:val="28"/>
+        </w:rPr>
+        <w:t>env</w:t>
       </w:r>
       <w:r>
         <w:rPr>

</xml_diff>

<commit_message>
kubernetes - kubectl updated
</commit_message>
<xml_diff>
--- a/Kubernetes/4-kubectl.docx
+++ b/Kubernetes/4-kubectl.docx
@@ -4,6 +4,7 @@
   <w:body>
     <w:p>
       <w:pPr>
+        <w:spacing w:after="100"/>
         <w:jc w:val="both"/>
         <w:rPr>
           <w:rFonts w:asciiTheme="majorBidi" w:hAnsiTheme="majorBidi" w:cstheme="majorBidi"/>
@@ -111,7 +112,7 @@
     </w:p>
     <w:p>
       <w:pPr>
-        <w:spacing w:after="120"/>
+        <w:spacing w:after="100"/>
         <w:jc w:val="both"/>
         <w:rPr>
           <w:rFonts w:asciiTheme="majorBidi" w:hAnsiTheme="majorBidi" w:cstheme="majorBidi"/>
@@ -507,6 +508,10 @@
       <w:r>
         <w:rPr>
           <w:rFonts w:asciiTheme="majorBidi" w:hAnsiTheme="majorBidi" w:cstheme="majorBidi"/>
+          <w:b/>
+          <w:bCs/>
+          <w:i/>
+          <w:iCs/>
           <w:sz w:val="28"/>
           <w:szCs w:val="28"/>
         </w:rPr>
@@ -662,6 +667,7 @@
     </w:p>
     <w:p>
       <w:pPr>
+        <w:spacing w:after="100"/>
         <w:jc w:val="both"/>
         <w:rPr>
           <w:rFonts w:asciiTheme="majorBidi" w:hAnsiTheme="majorBidi" w:cstheme="majorBidi"/>
@@ -716,6 +722,7 @@
     </w:p>
     <w:p>
       <w:pPr>
+        <w:spacing w:after="80"/>
         <w:jc w:val="both"/>
         <w:rPr>
           <w:rFonts w:asciiTheme="majorBidi" w:hAnsiTheme="majorBidi" w:cstheme="majorBidi"/>
@@ -772,6 +779,7 @@
     </w:p>
     <w:p>
       <w:pPr>
+        <w:spacing w:after="60"/>
         <w:jc w:val="both"/>
         <w:rPr>
           <w:rFonts w:asciiTheme="majorBidi" w:hAnsiTheme="majorBidi" w:cstheme="majorBidi"/>
@@ -808,6 +816,7 @@
     </w:p>
     <w:p>
       <w:pPr>
+        <w:spacing w:after="60"/>
         <w:jc w:val="both"/>
         <w:rPr>
           <w:rFonts w:asciiTheme="majorBidi" w:hAnsiTheme="majorBidi" w:cstheme="majorBidi"/>
@@ -844,24 +853,6 @@
           <w:szCs w:val="28"/>
         </w:rPr>
         <w:t xml:space="preserve"> [command] [TYPE] [NAME] [flags]</w:t>
-      </w:r>
-    </w:p>
-    <w:p>
-      <w:pPr>
-        <w:jc w:val="both"/>
-        <w:rPr>
-          <w:rFonts w:asciiTheme="majorBidi" w:hAnsiTheme="majorBidi" w:cstheme="majorBidi"/>
-          <w:sz w:val="28"/>
-          <w:szCs w:val="28"/>
-        </w:rPr>
-      </w:pPr>
-      <w:r>
-        <w:rPr>
-          <w:rFonts w:asciiTheme="majorBidi" w:hAnsiTheme="majorBidi" w:cstheme="majorBidi"/>
-          <w:sz w:val="28"/>
-          <w:szCs w:val="28"/>
-        </w:rPr>
-        <w:t>Each part of this structure has a specific purpose.</w:t>
       </w:r>
     </w:p>
     <w:p>
@@ -889,7 +880,6 @@
           <w:sz w:val="28"/>
           <w:szCs w:val="28"/>
         </w:rPr>
-        <w:lastRenderedPageBreak/>
         <w:t>command</w:t>
       </w:r>
       <w:r>
@@ -918,6 +908,7 @@
           <w:sz w:val="28"/>
           <w:szCs w:val="28"/>
         </w:rPr>
+        <w:lastRenderedPageBreak/>
         <w:t xml:space="preserve">specifies the action you want to perform. Common commands include </w:t>
       </w:r>
       <w:r>
@@ -1162,10 +1153,6 @@
     <w:p>
       <w:pPr>
         <w:pStyle w:val="ListParagraph"/>
-        <w:numPr>
-          <w:ilvl w:val="0"/>
-          <w:numId w:val="3"/>
-        </w:numPr>
         <w:ind w:left="360"/>
         <w:jc w:val="both"/>
         <w:rPr>
@@ -1843,40 +1830,136 @@
     </w:p>
     <w:p>
       <w:pPr>
+        <w:spacing w:after="80"/>
+        <w:jc w:val="both"/>
+        <w:rPr>
+          <w:rFonts w:asciiTheme="majorBidi" w:hAnsiTheme="majorBidi" w:cstheme="majorBidi"/>
+          <w:b/>
+          <w:bCs/>
+          <w:sz w:val="28"/>
+          <w:szCs w:val="28"/>
+        </w:rPr>
+      </w:pPr>
+      <w:r>
+        <w:rPr>
+          <w:rFonts w:asciiTheme="majorBidi" w:hAnsiTheme="majorBidi" w:cstheme="majorBidi"/>
+          <w:b/>
+          <w:bCs/>
+          <w:sz w:val="28"/>
+          <w:szCs w:val="28"/>
+        </w:rPr>
+        <w:t>Syntax</w:t>
+      </w:r>
+      <w:r>
+        <w:rPr>
+          <w:rFonts w:asciiTheme="majorBidi" w:hAnsiTheme="majorBidi" w:cstheme="majorBidi"/>
+          <w:b/>
+          <w:bCs/>
+          <w:sz w:val="28"/>
+          <w:szCs w:val="28"/>
+        </w:rPr>
+        <w:t>:</w:t>
+      </w:r>
+    </w:p>
+    <w:p>
+      <w:pPr>
         <w:spacing w:after="120"/>
         <w:jc w:val="both"/>
         <w:rPr>
           <w:rFonts w:asciiTheme="majorBidi" w:hAnsiTheme="majorBidi" w:cstheme="majorBidi"/>
           <w:b/>
           <w:bCs/>
-          <w:sz w:val="28"/>
-          <w:szCs w:val="28"/>
-        </w:rPr>
-      </w:pPr>
-      <w:r>
-        <w:rPr>
-          <w:rFonts w:asciiTheme="majorBidi" w:hAnsiTheme="majorBidi" w:cstheme="majorBidi"/>
-          <w:b/>
-          <w:bCs/>
-          <w:sz w:val="28"/>
-          <w:szCs w:val="28"/>
-        </w:rPr>
-        <w:t>Syntax</w:t>
-      </w:r>
-      <w:r>
-        <w:rPr>
-          <w:rFonts w:asciiTheme="majorBidi" w:hAnsiTheme="majorBidi" w:cstheme="majorBidi"/>
-          <w:b/>
-          <w:bCs/>
-          <w:sz w:val="28"/>
-          <w:szCs w:val="28"/>
+          <w:i/>
+          <w:iCs/>
+          <w:sz w:val="28"/>
+          <w:szCs w:val="28"/>
+        </w:rPr>
+      </w:pPr>
+      <w:proofErr w:type="spellStart"/>
+      <w:r>
+        <w:rPr>
+          <w:rFonts w:asciiTheme="majorBidi" w:hAnsiTheme="majorBidi" w:cstheme="majorBidi"/>
+          <w:b/>
+          <w:bCs/>
+          <w:i/>
+          <w:iCs/>
+          <w:sz w:val="28"/>
+          <w:szCs w:val="28"/>
+        </w:rPr>
+        <w:t>kubectl</w:t>
+      </w:r>
+      <w:proofErr w:type="spellEnd"/>
+      <w:r>
+        <w:rPr>
+          <w:rFonts w:asciiTheme="majorBidi" w:hAnsiTheme="majorBidi" w:cstheme="majorBidi"/>
+          <w:b/>
+          <w:bCs/>
+          <w:i/>
+          <w:iCs/>
+          <w:sz w:val="28"/>
+          <w:szCs w:val="28"/>
+        </w:rPr>
+        <w:t xml:space="preserve"> --</w:t>
+      </w:r>
+      <w:proofErr w:type="spellStart"/>
+      <w:r>
+        <w:rPr>
+          <w:rFonts w:asciiTheme="majorBidi" w:hAnsiTheme="majorBidi" w:cstheme="majorBidi"/>
+          <w:b/>
+          <w:bCs/>
+          <w:i/>
+          <w:iCs/>
+          <w:sz w:val="28"/>
+          <w:szCs w:val="28"/>
+        </w:rPr>
+        <w:t>kubeconfig</w:t>
+      </w:r>
+      <w:proofErr w:type="spellEnd"/>
+      <w:r>
+        <w:rPr>
+          <w:rFonts w:asciiTheme="majorBidi" w:hAnsiTheme="majorBidi" w:cstheme="majorBidi"/>
+          <w:b/>
+          <w:bCs/>
+          <w:i/>
+          <w:iCs/>
+          <w:sz w:val="28"/>
+          <w:szCs w:val="28"/>
+        </w:rPr>
+        <w:t>=&lt;path-to-config-file&gt; COMMAND</w:t>
+      </w:r>
+    </w:p>
+    <w:p>
+      <w:pPr>
+        <w:spacing w:after="80"/>
+        <w:jc w:val="both"/>
+        <w:rPr>
+          <w:rFonts w:asciiTheme="majorBidi" w:hAnsiTheme="majorBidi" w:cstheme="majorBidi"/>
+          <w:sz w:val="28"/>
+          <w:szCs w:val="28"/>
+          <w:u w:val="single"/>
+        </w:rPr>
+      </w:pPr>
+      <w:r>
+        <w:rPr>
+          <w:rFonts w:asciiTheme="majorBidi" w:hAnsiTheme="majorBidi" w:cstheme="majorBidi"/>
+          <w:sz w:val="28"/>
+          <w:szCs w:val="28"/>
+          <w:u w:val="single"/>
+        </w:rPr>
+        <w:t>Example</w:t>
+      </w:r>
+      <w:r>
+        <w:rPr>
+          <w:rFonts w:asciiTheme="majorBidi" w:hAnsiTheme="majorBidi" w:cstheme="majorBidi"/>
+          <w:sz w:val="28"/>
+          <w:szCs w:val="28"/>
+          <w:u w:val="single"/>
         </w:rPr>
         <w:t>:</w:t>
       </w:r>
     </w:p>
     <w:p>
       <w:pPr>
-        <w:spacing w:after="120"/>
         <w:jc w:val="both"/>
         <w:rPr>
           <w:rFonts w:asciiTheme="majorBidi" w:hAnsiTheme="majorBidi" w:cstheme="majorBidi"/>
@@ -1938,102 +2021,6 @@
           <w:sz w:val="28"/>
           <w:szCs w:val="28"/>
         </w:rPr>
-        <w:t>=&lt;path-to-config-file&gt; COMMAND</w:t>
-      </w:r>
-    </w:p>
-    <w:p>
-      <w:pPr>
-        <w:spacing w:after="120"/>
-        <w:jc w:val="both"/>
-        <w:rPr>
-          <w:rFonts w:asciiTheme="majorBidi" w:hAnsiTheme="majorBidi" w:cstheme="majorBidi"/>
-          <w:sz w:val="28"/>
-          <w:szCs w:val="28"/>
-          <w:u w:val="single"/>
-        </w:rPr>
-      </w:pPr>
-      <w:r>
-        <w:rPr>
-          <w:rFonts w:asciiTheme="majorBidi" w:hAnsiTheme="majorBidi" w:cstheme="majorBidi"/>
-          <w:sz w:val="28"/>
-          <w:szCs w:val="28"/>
-          <w:u w:val="single"/>
-        </w:rPr>
-        <w:t>Example</w:t>
-      </w:r>
-      <w:r>
-        <w:rPr>
-          <w:rFonts w:asciiTheme="majorBidi" w:hAnsiTheme="majorBidi" w:cstheme="majorBidi"/>
-          <w:sz w:val="28"/>
-          <w:szCs w:val="28"/>
-          <w:u w:val="single"/>
-        </w:rPr>
-        <w:t>:</w:t>
-      </w:r>
-    </w:p>
-    <w:p>
-      <w:pPr>
-        <w:jc w:val="both"/>
-        <w:rPr>
-          <w:rFonts w:asciiTheme="majorBidi" w:hAnsiTheme="majorBidi" w:cstheme="majorBidi"/>
-          <w:b/>
-          <w:bCs/>
-          <w:i/>
-          <w:iCs/>
-          <w:sz w:val="28"/>
-          <w:szCs w:val="28"/>
-        </w:rPr>
-      </w:pPr>
-      <w:proofErr w:type="spellStart"/>
-      <w:r>
-        <w:rPr>
-          <w:rFonts w:asciiTheme="majorBidi" w:hAnsiTheme="majorBidi" w:cstheme="majorBidi"/>
-          <w:b/>
-          <w:bCs/>
-          <w:i/>
-          <w:iCs/>
-          <w:sz w:val="28"/>
-          <w:szCs w:val="28"/>
-        </w:rPr>
-        <w:t>kubectl</w:t>
-      </w:r>
-      <w:proofErr w:type="spellEnd"/>
-      <w:r>
-        <w:rPr>
-          <w:rFonts w:asciiTheme="majorBidi" w:hAnsiTheme="majorBidi" w:cstheme="majorBidi"/>
-          <w:b/>
-          <w:bCs/>
-          <w:i/>
-          <w:iCs/>
-          <w:sz w:val="28"/>
-          <w:szCs w:val="28"/>
-        </w:rPr>
-        <w:t xml:space="preserve"> --</w:t>
-      </w:r>
-      <w:proofErr w:type="spellStart"/>
-      <w:r>
-        <w:rPr>
-          <w:rFonts w:asciiTheme="majorBidi" w:hAnsiTheme="majorBidi" w:cstheme="majorBidi"/>
-          <w:b/>
-          <w:bCs/>
-          <w:i/>
-          <w:iCs/>
-          <w:sz w:val="28"/>
-          <w:szCs w:val="28"/>
-        </w:rPr>
-        <w:t>kubeconfig</w:t>
-      </w:r>
-      <w:proofErr w:type="spellEnd"/>
-      <w:r>
-        <w:rPr>
-          <w:rFonts w:asciiTheme="majorBidi" w:hAnsiTheme="majorBidi" w:cstheme="majorBidi"/>
-          <w:b/>
-          <w:bCs/>
-          <w:i/>
-          <w:iCs/>
-          <w:sz w:val="28"/>
-          <w:szCs w:val="28"/>
-        </w:rPr>
         <w:t>=/home/user/dev-cluster-config get pods</w:t>
       </w:r>
     </w:p>
@@ -2047,17 +2034,15 @@
           <w:bCs/>
           <w:sz w:val="28"/>
           <w:szCs w:val="28"/>
-          <w:u w:val="single"/>
-        </w:rPr>
-      </w:pPr>
-      <w:r>
-        <w:rPr>
-          <w:rFonts w:asciiTheme="majorBidi" w:hAnsiTheme="majorBidi" w:cstheme="majorBidi"/>
-          <w:b/>
-          <w:bCs/>
-          <w:sz w:val="28"/>
-          <w:szCs w:val="28"/>
-          <w:u w:val="single"/>
+        </w:rPr>
+      </w:pPr>
+      <w:r>
+        <w:rPr>
+          <w:rFonts w:asciiTheme="majorBidi" w:hAnsiTheme="majorBidi" w:cstheme="majorBidi"/>
+          <w:b/>
+          <w:bCs/>
+          <w:sz w:val="28"/>
+          <w:szCs w:val="28"/>
         </w:rPr>
         <w:t>Purpose</w:t>
       </w:r>
@@ -2068,7 +2053,6 @@
           <w:bCs/>
           <w:sz w:val="28"/>
           <w:szCs w:val="28"/>
-          <w:u w:val="single"/>
         </w:rPr>
         <w:t>:</w:t>
       </w:r>
@@ -2203,8 +2187,78 @@
           <w:sz w:val="28"/>
           <w:szCs w:val="28"/>
         </w:rPr>
+        <w:t xml:space="preserve">The </w:t>
+      </w:r>
+      <w:proofErr w:type="spellStart"/>
+      <w:r>
+        <w:rPr>
+          <w:rFonts w:asciiTheme="majorBidi" w:hAnsiTheme="majorBidi" w:cstheme="majorBidi"/>
+          <w:sz w:val="28"/>
+          <w:szCs w:val="28"/>
+        </w:rPr>
+        <w:t>kubeconfig</w:t>
+      </w:r>
+      <w:proofErr w:type="spellEnd"/>
+      <w:r>
+        <w:rPr>
+          <w:rFonts w:asciiTheme="majorBidi" w:hAnsiTheme="majorBidi" w:cstheme="majorBidi"/>
+          <w:sz w:val="28"/>
+          <w:szCs w:val="28"/>
+        </w:rPr>
+        <w:t xml:space="preserve"> file is stored in a custom location</w:t>
+      </w:r>
+    </w:p>
+    <w:p>
+      <w:pPr>
+        <w:spacing w:after="120"/>
+        <w:jc w:val="both"/>
+        <w:rPr>
+          <w:rFonts w:asciiTheme="majorBidi" w:hAnsiTheme="majorBidi" w:cstheme="majorBidi"/>
+          <w:b/>
+          <w:bCs/>
+          <w:sz w:val="28"/>
+          <w:szCs w:val="28"/>
+        </w:rPr>
+      </w:pPr>
+      <w:r>
+        <w:rPr>
+          <w:rFonts w:asciiTheme="majorBidi" w:hAnsiTheme="majorBidi" w:cstheme="majorBidi"/>
+          <w:b/>
+          <w:bCs/>
+          <w:sz w:val="28"/>
+          <w:szCs w:val="28"/>
+        </w:rPr>
         <w:lastRenderedPageBreak/>
-        <w:t xml:space="preserve">The </w:t>
+        <w:t>Relationship with Contexts</w:t>
+      </w:r>
+      <w:r>
+        <w:rPr>
+          <w:rFonts w:asciiTheme="majorBidi" w:hAnsiTheme="majorBidi" w:cstheme="majorBidi"/>
+          <w:b/>
+          <w:bCs/>
+          <w:sz w:val="28"/>
+          <w:szCs w:val="28"/>
+        </w:rPr>
+        <w:t>:</w:t>
+      </w:r>
+    </w:p>
+    <w:p>
+      <w:pPr>
+        <w:spacing w:after="120"/>
+        <w:jc w:val="both"/>
+        <w:rPr>
+          <w:rFonts w:asciiTheme="majorBidi" w:hAnsiTheme="majorBidi" w:cstheme="majorBidi"/>
+          <w:sz w:val="28"/>
+          <w:szCs w:val="28"/>
+        </w:rPr>
+      </w:pPr>
+      <w:r>
+        <w:rPr>
+          <w:rFonts w:asciiTheme="majorBidi" w:hAnsiTheme="majorBidi" w:cstheme="majorBidi"/>
+          <w:sz w:val="28"/>
+          <w:szCs w:val="28"/>
+        </w:rPr>
+        <w:t xml:space="preserve">A </w:t>
       </w:r>
       <w:proofErr w:type="spellStart"/>
       <w:r>
@@ -2222,64 +2276,28 @@
           <w:sz w:val="28"/>
           <w:szCs w:val="28"/>
         </w:rPr>
-        <w:t xml:space="preserve"> file is stored in a custom location</w:t>
-      </w:r>
-    </w:p>
-    <w:p>
-      <w:pPr>
-        <w:spacing w:after="120"/>
-        <w:jc w:val="both"/>
-        <w:rPr>
-          <w:rFonts w:asciiTheme="majorBidi" w:hAnsiTheme="majorBidi" w:cstheme="majorBidi"/>
-          <w:b/>
-          <w:bCs/>
-          <w:sz w:val="28"/>
-          <w:szCs w:val="28"/>
-        </w:rPr>
-      </w:pPr>
-      <w:r>
-        <w:rPr>
-          <w:rFonts w:asciiTheme="majorBidi" w:hAnsiTheme="majorBidi" w:cstheme="majorBidi"/>
-          <w:b/>
-          <w:bCs/>
-          <w:sz w:val="28"/>
-          <w:szCs w:val="28"/>
-        </w:rPr>
-        <w:t>Relationship with Contexts</w:t>
-      </w:r>
-      <w:r>
-        <w:rPr>
-          <w:rFonts w:asciiTheme="majorBidi" w:hAnsiTheme="majorBidi" w:cstheme="majorBidi"/>
-          <w:b/>
-          <w:bCs/>
-          <w:sz w:val="28"/>
-          <w:szCs w:val="28"/>
-        </w:rPr>
-        <w:t>:</w:t>
-      </w:r>
-    </w:p>
-    <w:p>
-      <w:pPr>
-        <w:spacing w:after="120"/>
-        <w:jc w:val="both"/>
-        <w:rPr>
-          <w:rFonts w:asciiTheme="majorBidi" w:hAnsiTheme="majorBidi" w:cstheme="majorBidi"/>
-          <w:sz w:val="28"/>
-          <w:szCs w:val="28"/>
-        </w:rPr>
-      </w:pPr>
-      <w:r>
-        <w:rPr>
-          <w:rFonts w:asciiTheme="majorBidi" w:hAnsiTheme="majorBidi" w:cstheme="majorBidi"/>
-          <w:sz w:val="28"/>
-          <w:szCs w:val="28"/>
-        </w:rPr>
-        <w:t xml:space="preserve">A </w:t>
-      </w:r>
-      <w:proofErr w:type="spellStart"/>
-      <w:r>
-        <w:rPr>
-          <w:rFonts w:asciiTheme="majorBidi" w:hAnsiTheme="majorBidi" w:cstheme="majorBidi"/>
+        <w:t xml:space="preserve"> file may contain multiple contexts, each representing a specific combination of cluster, user, and namespace. When </w:t>
+      </w:r>
+      <w:r>
+        <w:rPr>
+          <w:rFonts w:asciiTheme="majorBidi" w:hAnsiTheme="majorBidi" w:cstheme="majorBidi"/>
+          <w:b/>
+          <w:bCs/>
+          <w:i/>
+          <w:iCs/>
+          <w:sz w:val="28"/>
+          <w:szCs w:val="28"/>
+        </w:rPr>
+        <w:t>--</w:t>
+      </w:r>
+      <w:proofErr w:type="spellStart"/>
+      <w:r>
+        <w:rPr>
+          <w:rFonts w:asciiTheme="majorBidi" w:hAnsiTheme="majorBidi" w:cstheme="majorBidi"/>
+          <w:b/>
+          <w:bCs/>
+          <w:i/>
+          <w:iCs/>
           <w:sz w:val="28"/>
           <w:szCs w:val="28"/>
         </w:rPr>
@@ -2292,30 +2310,16 @@
           <w:sz w:val="28"/>
           <w:szCs w:val="28"/>
         </w:rPr>
-        <w:t xml:space="preserve"> file may contain multiple contexts, each representing a specific combination of cluster, user, and namespace. When --</w:t>
-      </w:r>
-      <w:proofErr w:type="spellStart"/>
-      <w:r>
-        <w:rPr>
-          <w:rFonts w:asciiTheme="majorBidi" w:hAnsiTheme="majorBidi" w:cstheme="majorBidi"/>
-          <w:sz w:val="28"/>
-          <w:szCs w:val="28"/>
-        </w:rPr>
-        <w:t>kubeconfig</w:t>
-      </w:r>
-      <w:proofErr w:type="spellEnd"/>
-      <w:r>
-        <w:rPr>
-          <w:rFonts w:asciiTheme="majorBidi" w:hAnsiTheme="majorBidi" w:cstheme="majorBidi"/>
-          <w:sz w:val="28"/>
-          <w:szCs w:val="28"/>
-        </w:rPr>
         <w:t xml:space="preserve"> is used, </w:t>
       </w:r>
       <w:proofErr w:type="spellStart"/>
       <w:r>
         <w:rPr>
           <w:rFonts w:asciiTheme="majorBidi" w:hAnsiTheme="majorBidi" w:cstheme="majorBidi"/>
+          <w:b/>
+          <w:bCs/>
+          <w:i/>
+          <w:iCs/>
           <w:sz w:val="28"/>
           <w:szCs w:val="28"/>
         </w:rPr>
@@ -2815,6 +2819,10 @@
       <w:r>
         <w:rPr>
           <w:rFonts w:asciiTheme="majorBidi" w:hAnsiTheme="majorBidi" w:cstheme="majorBidi"/>
+          <w:b/>
+          <w:bCs/>
+          <w:i/>
+          <w:iCs/>
           <w:sz w:val="28"/>
           <w:szCs w:val="28"/>
         </w:rPr>
@@ -3205,19 +3213,22 @@
           <w:rFonts w:asciiTheme="majorBidi" w:hAnsiTheme="majorBidi" w:cstheme="majorBidi"/>
           <w:sz w:val="28"/>
           <w:szCs w:val="28"/>
-        </w:rPr>
-      </w:pPr>
-      <w:r>
-        <w:rPr>
-          <w:rFonts w:asciiTheme="majorBidi" w:hAnsiTheme="majorBidi" w:cstheme="majorBidi"/>
-          <w:sz w:val="28"/>
-          <w:szCs w:val="28"/>
+          <w:u w:val="single"/>
+        </w:rPr>
+      </w:pPr>
+      <w:r>
+        <w:rPr>
+          <w:rFonts w:asciiTheme="majorBidi" w:hAnsiTheme="majorBidi" w:cstheme="majorBidi"/>
+          <w:sz w:val="28"/>
+          <w:szCs w:val="28"/>
+          <w:u w:val="single"/>
         </w:rPr>
         <w:t>Example:</w:t>
       </w:r>
     </w:p>
     <w:p>
       <w:pPr>
+        <w:spacing w:after="80"/>
         <w:jc w:val="both"/>
         <w:rPr>
           <w:rFonts w:asciiTheme="majorBidi" w:hAnsiTheme="majorBidi" w:cstheme="majorBidi"/>
@@ -3316,6 +3327,10 @@
       <w:r>
         <w:rPr>
           <w:rFonts w:asciiTheme="majorBidi" w:hAnsiTheme="majorBidi" w:cstheme="majorBidi"/>
+          <w:b/>
+          <w:bCs/>
+          <w:i/>
+          <w:iCs/>
           <w:sz w:val="28"/>
           <w:szCs w:val="28"/>
         </w:rPr>
@@ -3325,19 +3340,22 @@
       <w:r>
         <w:rPr>
           <w:rFonts w:asciiTheme="majorBidi" w:hAnsiTheme="majorBidi" w:cstheme="majorBidi"/>
-          <w:sz w:val="28"/>
-          <w:szCs w:val="28"/>
-        </w:rPr>
-        <w:t xml:space="preserve"> config command is essential when working with multiple clusters or environments, such as development, testing, and production clusters. It allows users to manage connection </w:t>
-      </w:r>
-      <w:r>
-        <w:rPr>
-          <w:rFonts w:asciiTheme="majorBidi" w:hAnsiTheme="majorBidi" w:cstheme="majorBidi"/>
-          <w:sz w:val="28"/>
-          <w:szCs w:val="28"/>
-        </w:rPr>
-        <w:lastRenderedPageBreak/>
-        <w:t xml:space="preserve">settings, switch between clusters safely, and ensure that </w:t>
+          <w:b/>
+          <w:bCs/>
+          <w:i/>
+          <w:iCs/>
+          <w:sz w:val="28"/>
+          <w:szCs w:val="28"/>
+        </w:rPr>
+        <w:t xml:space="preserve"> config</w:t>
+      </w:r>
+      <w:r>
+        <w:rPr>
+          <w:rFonts w:asciiTheme="majorBidi" w:hAnsiTheme="majorBidi" w:cstheme="majorBidi"/>
+          <w:sz w:val="28"/>
+          <w:szCs w:val="28"/>
+        </w:rPr>
+        <w:t xml:space="preserve"> command is essential when working with multiple clusters or environments, such as development, testing, and production clusters. It allows users to manage connection settings, switch between clusters safely, and ensure that </w:t>
       </w:r>
       <w:proofErr w:type="spellStart"/>
       <w:r>
@@ -3381,6 +3399,7 @@
           <w:sz w:val="36"/>
           <w:szCs w:val="36"/>
         </w:rPr>
+        <w:lastRenderedPageBreak/>
         <w:t>kubectl</w:t>
       </w:r>
       <w:proofErr w:type="spellEnd"/>
@@ -3981,440 +4000,29 @@
         <w:jc w:val="both"/>
         <w:rPr>
           <w:rFonts w:asciiTheme="majorBidi" w:hAnsiTheme="majorBidi" w:cstheme="majorBidi"/>
-          <w:sz w:val="28"/>
-          <w:szCs w:val="28"/>
-        </w:rPr>
-      </w:pPr>
-      <w:r>
-        <w:rPr>
-          <w:rFonts w:asciiTheme="majorBidi" w:hAnsiTheme="majorBidi" w:cstheme="majorBidi"/>
-          <w:sz w:val="28"/>
-          <w:szCs w:val="28"/>
-        </w:rPr>
-        <w:t>Example Output</w:t>
-      </w:r>
-    </w:p>
-    <w:p>
-      <w:pPr>
-        <w:pStyle w:val="ListParagraph"/>
-        <w:ind w:left="360"/>
-        <w:jc w:val="both"/>
-        <w:rPr>
-          <w:rFonts w:asciiTheme="majorBidi" w:hAnsiTheme="majorBidi" w:cstheme="majorBidi"/>
-          <w:sz w:val="28"/>
-          <w:szCs w:val="28"/>
-        </w:rPr>
-      </w:pPr>
-      <w:r>
-        <w:rPr>
-          <w:rFonts w:asciiTheme="majorBidi" w:hAnsiTheme="majorBidi" w:cstheme="majorBidi"/>
-          <w:noProof/>
-          <w:sz w:val="28"/>
-          <w:szCs w:val="28"/>
-        </w:rPr>
-        <mc:AlternateContent>
-          <mc:Choice Requires="wps">
-            <w:drawing>
-              <wp:anchor distT="0" distB="0" distL="114300" distR="114300" simplePos="0" relativeHeight="251659264" behindDoc="0" locked="0" layoutInCell="1" allowOverlap="1" wp14:anchorId="1262ABF6" wp14:editId="6DD1A0DD">
-                <wp:simplePos x="0" y="0"/>
-                <wp:positionH relativeFrom="column">
-                  <wp:posOffset>213360</wp:posOffset>
-                </wp:positionH>
-                <wp:positionV relativeFrom="paragraph">
-                  <wp:posOffset>56515</wp:posOffset>
-                </wp:positionV>
-                <wp:extent cx="5486400" cy="1569720"/>
-                <wp:effectExtent l="0" t="0" r="19050" b="11430"/>
-                <wp:wrapNone/>
-                <wp:docPr id="1244568144" name="Rectangle 1"/>
-                <wp:cNvGraphicFramePr/>
-                <a:graphic xmlns:a="http://schemas.openxmlformats.org/drawingml/2006/main">
-                  <a:graphicData uri="http://schemas.microsoft.com/office/word/2010/wordprocessingShape">
-                    <wps:wsp>
-                      <wps:cNvSpPr/>
-                      <wps:spPr>
-                        <a:xfrm>
-                          <a:off x="0" y="0"/>
-                          <a:ext cx="5486400" cy="1569720"/>
-                        </a:xfrm>
-                        <a:prstGeom prst="rect">
-                          <a:avLst/>
-                        </a:prstGeom>
-                      </wps:spPr>
-                      <wps:style>
-                        <a:lnRef idx="2">
-                          <a:schemeClr val="dk1">
-                            <a:shade val="15000"/>
-                          </a:schemeClr>
-                        </a:lnRef>
-                        <a:fillRef idx="1">
-                          <a:schemeClr val="dk1"/>
-                        </a:fillRef>
-                        <a:effectRef idx="0">
-                          <a:schemeClr val="dk1"/>
-                        </a:effectRef>
-                        <a:fontRef idx="minor">
-                          <a:schemeClr val="lt1"/>
-                        </a:fontRef>
-                      </wps:style>
-                      <wps:txbx>
-                        <w:txbxContent>
-                          <w:p>
-                            <w:pPr>
-                              <w:spacing w:after="0"/>
-                              <w:rPr>
-                                <w:rFonts w:asciiTheme="majorBidi" w:hAnsiTheme="majorBidi" w:cstheme="majorBidi"/>
-                                <w:sz w:val="28"/>
-                                <w:szCs w:val="28"/>
-                              </w:rPr>
-                            </w:pPr>
-                            <w:r>
-                              <w:rPr>
-                                <w:rFonts w:asciiTheme="majorBidi" w:hAnsiTheme="majorBidi" w:cstheme="majorBidi"/>
-                                <w:sz w:val="28"/>
-                                <w:szCs w:val="28"/>
-                              </w:rPr>
-                              <w:t>NAME        SHORTNAMES   APIGROUP   NAMESPACED   KIND</w:t>
-                            </w:r>
-                          </w:p>
-                          <w:p>
-                            <w:pPr>
-                              <w:spacing w:after="0"/>
-                              <w:rPr>
-                                <w:rFonts w:asciiTheme="majorBidi" w:hAnsiTheme="majorBidi" w:cstheme="majorBidi"/>
-                                <w:sz w:val="28"/>
-                                <w:szCs w:val="28"/>
-                              </w:rPr>
-                            </w:pPr>
-                            <w:r>
-                              <w:rPr>
-                                <w:rFonts w:asciiTheme="majorBidi" w:hAnsiTheme="majorBidi" w:cstheme="majorBidi"/>
-                                <w:sz w:val="28"/>
-                                <w:szCs w:val="28"/>
-                              </w:rPr>
-                              <w:t>pods        po                      true         Pod</w:t>
-                            </w:r>
-                          </w:p>
-                          <w:p>
-                            <w:pPr>
-                              <w:spacing w:after="0"/>
-                              <w:rPr>
-                                <w:rFonts w:asciiTheme="majorBidi" w:hAnsiTheme="majorBidi" w:cstheme="majorBidi"/>
-                                <w:sz w:val="28"/>
-                                <w:szCs w:val="28"/>
-                              </w:rPr>
-                            </w:pPr>
-                            <w:r>
-                              <w:rPr>
-                                <w:rFonts w:asciiTheme="majorBidi" w:hAnsiTheme="majorBidi" w:cstheme="majorBidi"/>
-                                <w:sz w:val="28"/>
-                                <w:szCs w:val="28"/>
-                              </w:rPr>
-                              <w:t>services    svc                     true         Service</w:t>
-                            </w:r>
-                          </w:p>
-                          <w:p>
-                            <w:pPr>
-                              <w:spacing w:after="0"/>
-                              <w:rPr>
-                                <w:rFonts w:asciiTheme="majorBidi" w:hAnsiTheme="majorBidi" w:cstheme="majorBidi"/>
-                                <w:sz w:val="28"/>
-                                <w:szCs w:val="28"/>
-                              </w:rPr>
-                            </w:pPr>
-                            <w:r>
-                              <w:rPr>
-                                <w:rFonts w:asciiTheme="majorBidi" w:hAnsiTheme="majorBidi" w:cstheme="majorBidi"/>
-                                <w:sz w:val="28"/>
-                                <w:szCs w:val="28"/>
-                              </w:rPr>
-                              <w:t>deployments deploy      apps       true         Deployment</w:t>
-                            </w:r>
-                          </w:p>
-                          <w:p>
-                            <w:pPr>
-                              <w:spacing w:after="0"/>
-                              <w:rPr>
-                                <w:rFonts w:asciiTheme="majorBidi" w:hAnsiTheme="majorBidi" w:cstheme="majorBidi"/>
-                                <w:sz w:val="28"/>
-                                <w:szCs w:val="28"/>
-                              </w:rPr>
-                            </w:pPr>
-                            <w:r>
-                              <w:rPr>
-                                <w:rFonts w:asciiTheme="majorBidi" w:hAnsiTheme="majorBidi" w:cstheme="majorBidi"/>
-                                <w:sz w:val="28"/>
-                                <w:szCs w:val="28"/>
-                              </w:rPr>
-                              <w:t>nodes       no                      false        Node</w:t>
-                            </w:r>
-                          </w:p>
-                          <w:p>
-                            <w:pPr>
-                              <w:rPr>
-                                <w:rFonts w:asciiTheme="majorBidi" w:hAnsiTheme="majorBidi" w:cstheme="majorBidi"/>
-                                <w:sz w:val="28"/>
-                                <w:szCs w:val="28"/>
-                              </w:rPr>
-                            </w:pPr>
-                            <w:r>
-                              <w:rPr>
-                                <w:rFonts w:asciiTheme="majorBidi" w:hAnsiTheme="majorBidi" w:cstheme="majorBidi"/>
-                                <w:sz w:val="28"/>
-                                <w:szCs w:val="28"/>
-                              </w:rPr>
-                              <w:t>namespaces  ns                      false        Namespace</w:t>
-                            </w:r>
-                          </w:p>
-                          <w:p>
-                            <w:pPr>
-                              <w:jc w:val="center"/>
-                            </w:pPr>
-                          </w:p>
-                        </w:txbxContent>
-                      </wps:txbx>
-                      <wps:bodyPr rot="0" spcFirstLastPara="0" vertOverflow="overflow" horzOverflow="overflow" vert="horz" wrap="square" lIns="91440" tIns="45720" rIns="91440" bIns="45720" numCol="1" spcCol="0" rtlCol="0" fromWordArt="0" anchor="ctr" anchorCtr="0" forceAA="0" compatLnSpc="1">
-                        <a:prstTxWarp prst="textNoShape">
-                          <a:avLst/>
-                        </a:prstTxWarp>
-                        <a:noAutofit/>
-                      </wps:bodyPr>
-                    </wps:wsp>
-                  </a:graphicData>
-                </a:graphic>
-                <wp14:sizeRelH relativeFrom="margin">
-                  <wp14:pctWidth>0</wp14:pctWidth>
-                </wp14:sizeRelH>
-                <wp14:sizeRelV relativeFrom="margin">
-                  <wp14:pctHeight>0</wp14:pctHeight>
-                </wp14:sizeRelV>
-              </wp:anchor>
-            </w:drawing>
-          </mc:Choice>
-          <mc:Fallback>
-            <w:pict>
-              <v:rect w14:anchorId="1262ABF6" id="Rectangle 1" o:spid="_x0000_s1026" style="position:absolute;left:0;text-align:left;margin-left:16.8pt;margin-top:4.45pt;width:6in;height:123.6pt;z-index:251659264;visibility:visible;mso-wrap-style:square;mso-width-percent:0;mso-height-percent:0;mso-wrap-distance-left:9pt;mso-wrap-distance-top:0;mso-wrap-distance-right:9pt;mso-wrap-distance-bottom:0;mso-position-horizontal:absolute;mso-position-horizontal-relative:text;mso-position-vertical:absolute;mso-position-vertical-relative:text;mso-width-percent:0;mso-height-percent:0;mso-width-relative:margin;mso-height-relative:margin;v-text-anchor:middle" o:gfxdata="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" fillcolor="black [3200]" strokecolor="black [480]" strokeweight="1pt">
-                <v:textbox>
-                  <w:txbxContent>
-                    <w:p>
-                      <w:pPr>
-                        <w:spacing w:after="0"/>
-                        <w:rPr>
-                          <w:rFonts w:asciiTheme="majorBidi" w:hAnsiTheme="majorBidi" w:cstheme="majorBidi"/>
-                          <w:sz w:val="28"/>
-                          <w:szCs w:val="28"/>
-                        </w:rPr>
-                      </w:pPr>
-                      <w:r>
-                        <w:rPr>
-                          <w:rFonts w:asciiTheme="majorBidi" w:hAnsiTheme="majorBidi" w:cstheme="majorBidi"/>
-                          <w:sz w:val="28"/>
-                          <w:szCs w:val="28"/>
-                        </w:rPr>
-                        <w:t>NAME        SHORTNAMES   APIGROUP   NAMESPACED   KIND</w:t>
-                      </w:r>
-                    </w:p>
-                    <w:p>
-                      <w:pPr>
-                        <w:spacing w:after="0"/>
-                        <w:rPr>
-                          <w:rFonts w:asciiTheme="majorBidi" w:hAnsiTheme="majorBidi" w:cstheme="majorBidi"/>
-                          <w:sz w:val="28"/>
-                          <w:szCs w:val="28"/>
-                        </w:rPr>
-                      </w:pPr>
-                      <w:r>
-                        <w:rPr>
-                          <w:rFonts w:asciiTheme="majorBidi" w:hAnsiTheme="majorBidi" w:cstheme="majorBidi"/>
-                          <w:sz w:val="28"/>
-                          <w:szCs w:val="28"/>
-                        </w:rPr>
-                        <w:t>pods        po                      true         Pod</w:t>
-                      </w:r>
-                    </w:p>
-                    <w:p>
-                      <w:pPr>
-                        <w:spacing w:after="0"/>
-                        <w:rPr>
-                          <w:rFonts w:asciiTheme="majorBidi" w:hAnsiTheme="majorBidi" w:cstheme="majorBidi"/>
-                          <w:sz w:val="28"/>
-                          <w:szCs w:val="28"/>
-                        </w:rPr>
-                      </w:pPr>
-                      <w:r>
-                        <w:rPr>
-                          <w:rFonts w:asciiTheme="majorBidi" w:hAnsiTheme="majorBidi" w:cstheme="majorBidi"/>
-                          <w:sz w:val="28"/>
-                          <w:szCs w:val="28"/>
-                        </w:rPr>
-                        <w:t>services    svc                     true         Service</w:t>
-                      </w:r>
-                    </w:p>
-                    <w:p>
-                      <w:pPr>
-                        <w:spacing w:after="0"/>
-                        <w:rPr>
-                          <w:rFonts w:asciiTheme="majorBidi" w:hAnsiTheme="majorBidi" w:cstheme="majorBidi"/>
-                          <w:sz w:val="28"/>
-                          <w:szCs w:val="28"/>
-                        </w:rPr>
-                      </w:pPr>
-                      <w:r>
-                        <w:rPr>
-                          <w:rFonts w:asciiTheme="majorBidi" w:hAnsiTheme="majorBidi" w:cstheme="majorBidi"/>
-                          <w:sz w:val="28"/>
-                          <w:szCs w:val="28"/>
-                        </w:rPr>
-                        <w:t>deployments deploy      apps       true         Deployment</w:t>
-                      </w:r>
-                    </w:p>
-                    <w:p>
-                      <w:pPr>
-                        <w:spacing w:after="0"/>
-                        <w:rPr>
-                          <w:rFonts w:asciiTheme="majorBidi" w:hAnsiTheme="majorBidi" w:cstheme="majorBidi"/>
-                          <w:sz w:val="28"/>
-                          <w:szCs w:val="28"/>
-                        </w:rPr>
-                      </w:pPr>
-                      <w:r>
-                        <w:rPr>
-                          <w:rFonts w:asciiTheme="majorBidi" w:hAnsiTheme="majorBidi" w:cstheme="majorBidi"/>
-                          <w:sz w:val="28"/>
-                          <w:szCs w:val="28"/>
-                        </w:rPr>
-                        <w:t>nodes       no                      false        Node</w:t>
-                      </w:r>
-                    </w:p>
-                    <w:p>
-                      <w:pPr>
-                        <w:rPr>
-                          <w:rFonts w:asciiTheme="majorBidi" w:hAnsiTheme="majorBidi" w:cstheme="majorBidi"/>
-                          <w:sz w:val="28"/>
-                          <w:szCs w:val="28"/>
-                        </w:rPr>
-                      </w:pPr>
-                      <w:r>
-                        <w:rPr>
-                          <w:rFonts w:asciiTheme="majorBidi" w:hAnsiTheme="majorBidi" w:cstheme="majorBidi"/>
-                          <w:sz w:val="28"/>
-                          <w:szCs w:val="28"/>
-                        </w:rPr>
-                        <w:t>namespaces  ns                      false        Namespace</w:t>
-                      </w:r>
-                    </w:p>
-                    <w:p>
-                      <w:pPr>
-                        <w:jc w:val="center"/>
-                      </w:pPr>
-                    </w:p>
-                  </w:txbxContent>
-                </v:textbox>
-              </v:rect>
-            </w:pict>
-          </mc:Fallback>
-        </mc:AlternateContent>
-      </w:r>
-    </w:p>
-    <w:p>
-      <w:pPr>
-        <w:pStyle w:val="ListParagraph"/>
-        <w:ind w:left="360"/>
-        <w:jc w:val="both"/>
-        <w:rPr>
-          <w:rFonts w:asciiTheme="majorBidi" w:hAnsiTheme="majorBidi" w:cstheme="majorBidi"/>
-          <w:sz w:val="28"/>
-          <w:szCs w:val="28"/>
-        </w:rPr>
-      </w:pPr>
-    </w:p>
-    <w:p>
-      <w:pPr>
-        <w:pStyle w:val="ListParagraph"/>
-        <w:ind w:left="360"/>
-        <w:jc w:val="both"/>
-        <w:rPr>
-          <w:rFonts w:asciiTheme="majorBidi" w:hAnsiTheme="majorBidi" w:cstheme="majorBidi"/>
-          <w:sz w:val="28"/>
-          <w:szCs w:val="28"/>
-        </w:rPr>
-      </w:pPr>
-    </w:p>
-    <w:p>
-      <w:pPr>
-        <w:pStyle w:val="ListParagraph"/>
-        <w:ind w:left="360"/>
-        <w:jc w:val="both"/>
-        <w:rPr>
-          <w:rFonts w:asciiTheme="majorBidi" w:hAnsiTheme="majorBidi" w:cstheme="majorBidi"/>
-          <w:sz w:val="28"/>
-          <w:szCs w:val="28"/>
-        </w:rPr>
-      </w:pPr>
-    </w:p>
-    <w:p>
-      <w:pPr>
-        <w:pStyle w:val="ListParagraph"/>
-        <w:ind w:left="360"/>
-        <w:jc w:val="both"/>
-        <w:rPr>
-          <w:rFonts w:asciiTheme="majorBidi" w:hAnsiTheme="majorBidi" w:cstheme="majorBidi"/>
-          <w:sz w:val="28"/>
-          <w:szCs w:val="28"/>
-        </w:rPr>
-      </w:pPr>
-    </w:p>
-    <w:p>
-      <w:pPr>
-        <w:pStyle w:val="ListParagraph"/>
-        <w:ind w:left="360"/>
-        <w:jc w:val="both"/>
-        <w:rPr>
-          <w:rFonts w:asciiTheme="majorBidi" w:hAnsiTheme="majorBidi" w:cstheme="majorBidi"/>
-          <w:sz w:val="28"/>
-          <w:szCs w:val="28"/>
-        </w:rPr>
-      </w:pPr>
-    </w:p>
-    <w:p>
-      <w:pPr>
-        <w:pStyle w:val="ListParagraph"/>
-        <w:ind w:left="360"/>
-        <w:jc w:val="both"/>
-        <w:rPr>
-          <w:rFonts w:asciiTheme="majorBidi" w:hAnsiTheme="majorBidi" w:cstheme="majorBidi"/>
-          <w:sz w:val="28"/>
-          <w:szCs w:val="28"/>
-        </w:rPr>
-      </w:pPr>
-    </w:p>
-    <w:p>
-      <w:pPr>
-        <w:pStyle w:val="ListParagraph"/>
-        <w:ind w:left="360"/>
-        <w:jc w:val="both"/>
-        <w:rPr>
-          <w:rFonts w:asciiTheme="majorBidi" w:hAnsiTheme="majorBidi" w:cstheme="majorBidi"/>
-          <w:sz w:val="28"/>
-          <w:szCs w:val="28"/>
-          <w:u w:val="single"/>
-        </w:rPr>
-      </w:pPr>
-      <w:r>
-        <w:rPr>
-          <w:rFonts w:asciiTheme="majorBidi" w:hAnsiTheme="majorBidi" w:cstheme="majorBidi"/>
-          <w:sz w:val="28"/>
-          <w:szCs w:val="28"/>
-          <w:u w:val="single"/>
+          <w:b/>
+          <w:bCs/>
+          <w:sz w:val="28"/>
+          <w:szCs w:val="28"/>
+        </w:rPr>
+      </w:pPr>
+      <w:r>
+        <w:rPr>
+          <w:rFonts w:asciiTheme="majorBidi" w:hAnsiTheme="majorBidi" w:cstheme="majorBidi"/>
+          <w:b/>
+          <w:bCs/>
+          <w:sz w:val="28"/>
+          <w:szCs w:val="28"/>
         </w:rPr>
         <w:t>Output Columns</w:t>
       </w:r>
       <w:r>
         <w:rPr>
           <w:rFonts w:asciiTheme="majorBidi" w:hAnsiTheme="majorBidi" w:cstheme="majorBidi"/>
-          <w:sz w:val="28"/>
-          <w:szCs w:val="28"/>
-          <w:u w:val="single"/>
+          <w:b/>
+          <w:bCs/>
+          <w:sz w:val="28"/>
+          <w:szCs w:val="28"/>
         </w:rPr>
         <w:t>:</w:t>
       </w:r>
@@ -4443,7 +4051,6 @@
           <w:sz w:val="28"/>
           <w:szCs w:val="28"/>
         </w:rPr>
-        <w:lastRenderedPageBreak/>
         <w:t>NAME</w:t>
       </w:r>
       <w:r>
@@ -4948,24 +4555,27 @@
     </w:p>
     <w:p>
       <w:pPr>
-        <w:jc w:val="both"/>
-        <w:rPr>
-          <w:rFonts w:asciiTheme="majorBidi" w:hAnsiTheme="majorBidi" w:cstheme="majorBidi"/>
-          <w:sz w:val="28"/>
-          <w:szCs w:val="28"/>
-        </w:rPr>
-      </w:pPr>
-      <w:r>
-        <w:rPr>
-          <w:rFonts w:asciiTheme="majorBidi" w:hAnsiTheme="majorBidi" w:cstheme="majorBidi"/>
-          <w:sz w:val="28"/>
-          <w:szCs w:val="28"/>
-        </w:rPr>
+        <w:spacing w:after="100"/>
+        <w:jc w:val="both"/>
+        <w:rPr>
+          <w:rFonts w:asciiTheme="majorBidi" w:hAnsiTheme="majorBidi" w:cstheme="majorBidi"/>
+          <w:sz w:val="28"/>
+          <w:szCs w:val="28"/>
+        </w:rPr>
+      </w:pPr>
+      <w:r>
+        <w:rPr>
+          <w:rFonts w:asciiTheme="majorBidi" w:hAnsiTheme="majorBidi" w:cstheme="majorBidi"/>
+          <w:sz w:val="28"/>
+          <w:szCs w:val="28"/>
+        </w:rPr>
+        <w:lastRenderedPageBreak/>
         <w:t>These cluster-level commands are essential for ensuring that the underlying infrastructure is functioning correctly before deploying or managing resources.</w:t>
       </w:r>
     </w:p>
     <w:p>
       <w:pPr>
+        <w:spacing w:after="80"/>
         <w:jc w:val="both"/>
         <w:rPr>
           <w:rFonts w:asciiTheme="majorBidi" w:hAnsiTheme="majorBidi" w:cstheme="majorBidi"/>
@@ -4988,6 +4598,7 @@
     </w:p>
     <w:p>
       <w:pPr>
+        <w:spacing w:after="60"/>
         <w:jc w:val="both"/>
         <w:rPr>
           <w:rFonts w:asciiTheme="majorBidi" w:hAnsiTheme="majorBidi" w:cstheme="majorBidi"/>
@@ -5050,6 +4661,7 @@
     </w:p>
     <w:p>
       <w:pPr>
+        <w:spacing w:after="60"/>
         <w:jc w:val="both"/>
         <w:rPr>
           <w:rFonts w:asciiTheme="majorBidi" w:hAnsiTheme="majorBidi" w:cstheme="majorBidi"/>
@@ -5128,6 +4740,7 @@
     </w:p>
     <w:p>
       <w:pPr>
+        <w:spacing w:after="100"/>
         <w:jc w:val="both"/>
         <w:rPr>
           <w:rFonts w:asciiTheme="majorBidi" w:hAnsiTheme="majorBidi" w:cstheme="majorBidi"/>
@@ -5210,6 +4823,7 @@
     </w:p>
     <w:p>
       <w:pPr>
+        <w:spacing w:after="80"/>
         <w:jc w:val="both"/>
         <w:rPr>
           <w:rFonts w:asciiTheme="majorBidi" w:hAnsiTheme="majorBidi" w:cstheme="majorBidi"/>
@@ -5244,6 +4858,7 @@
     </w:p>
     <w:p>
       <w:pPr>
+        <w:spacing w:after="80"/>
         <w:jc w:val="both"/>
         <w:rPr>
           <w:rFonts w:asciiTheme="majorBidi" w:hAnsiTheme="majorBidi" w:cstheme="majorBidi"/>
@@ -5349,6 +4964,7 @@
           <w:ilvl w:val="0"/>
           <w:numId w:val="6"/>
         </w:numPr>
+        <w:spacing w:after="80"/>
         <w:ind w:left="360"/>
         <w:jc w:val="both"/>
         <w:rPr>
@@ -5380,6 +4996,7 @@
     </w:p>
     <w:p>
       <w:pPr>
+        <w:spacing w:after="60"/>
         <w:jc w:val="both"/>
         <w:rPr>
           <w:rFonts w:asciiTheme="majorBidi" w:hAnsiTheme="majorBidi" w:cstheme="majorBidi"/>
@@ -5564,6 +5181,7 @@
           <w:ilvl w:val="0"/>
           <w:numId w:val="7"/>
         </w:numPr>
+        <w:spacing w:after="100"/>
         <w:ind w:left="360"/>
         <w:jc w:val="both"/>
         <w:rPr>
@@ -5609,6 +5227,7 @@
     </w:p>
     <w:p>
       <w:pPr>
+        <w:spacing w:after="80"/>
         <w:jc w:val="both"/>
         <w:rPr>
           <w:rFonts w:asciiTheme="majorBidi" w:hAnsiTheme="majorBidi" w:cstheme="majorBidi"/>
@@ -5626,7 +5245,6 @@
           <w:sz w:val="32"/>
           <w:szCs w:val="32"/>
         </w:rPr>
-        <w:lastRenderedPageBreak/>
         <w:t>Default Output</w:t>
       </w:r>
       <w:r>
@@ -5642,6 +5260,7 @@
     </w:p>
     <w:p>
       <w:pPr>
+        <w:spacing w:after="60"/>
         <w:jc w:val="both"/>
         <w:rPr>
           <w:rFonts w:asciiTheme="majorBidi" w:hAnsiTheme="majorBidi" w:cstheme="majorBidi"/>
@@ -5877,6 +5496,7 @@
           <w:ilvl w:val="0"/>
           <w:numId w:val="8"/>
         </w:numPr>
+        <w:spacing w:after="100"/>
         <w:ind w:left="360"/>
         <w:jc w:val="both"/>
         <w:rPr>
@@ -5908,6 +5528,7 @@
     </w:p>
     <w:p>
       <w:pPr>
+        <w:spacing w:after="60"/>
         <w:jc w:val="both"/>
         <w:rPr>
           <w:rFonts w:asciiTheme="majorBidi" w:hAnsiTheme="majorBidi" w:cstheme="majorBidi"/>
@@ -5940,6 +5561,7 @@
     </w:p>
     <w:p>
       <w:pPr>
+        <w:spacing w:after="60"/>
         <w:jc w:val="both"/>
         <w:rPr>
           <w:rFonts w:asciiTheme="majorBidi" w:hAnsiTheme="majorBidi" w:cstheme="majorBidi"/>
@@ -6080,6 +5702,7 @@
           <w:sz w:val="28"/>
           <w:szCs w:val="28"/>
         </w:rPr>
+        <w:lastRenderedPageBreak/>
         <w:t>kubectl</w:t>
       </w:r>
       <w:proofErr w:type="spellEnd"/>
@@ -6359,6 +5982,7 @@
     <w:p>
       <w:pPr>
         <w:pStyle w:val="ListParagraph"/>
+        <w:spacing w:after="120"/>
         <w:ind w:left="360"/>
         <w:jc w:val="both"/>
         <w:rPr>
@@ -6424,6 +6048,7 @@
     </w:p>
     <w:p>
       <w:pPr>
+        <w:spacing w:after="80"/>
         <w:jc w:val="both"/>
         <w:rPr>
           <w:rFonts w:asciiTheme="majorBidi" w:hAnsiTheme="majorBidi" w:cstheme="majorBidi"/>
@@ -6486,6 +6111,7 @@
     </w:p>
     <w:p>
       <w:pPr>
+        <w:spacing w:after="80"/>
         <w:jc w:val="both"/>
         <w:rPr>
           <w:rFonts w:asciiTheme="majorBidi" w:hAnsiTheme="majorBidi" w:cstheme="majorBidi"/>
@@ -6598,6 +6224,7 @@
     </w:p>
     <w:p>
       <w:pPr>
+        <w:spacing w:after="60"/>
         <w:jc w:val="both"/>
         <w:rPr>
           <w:rFonts w:asciiTheme="majorBidi" w:hAnsiTheme="majorBidi" w:cstheme="majorBidi"/>
@@ -6630,6 +6257,7 @@
     </w:p>
     <w:p>
       <w:pPr>
+        <w:spacing w:after="60"/>
         <w:jc w:val="both"/>
         <w:rPr>
           <w:rFonts w:asciiTheme="majorBidi" w:hAnsiTheme="majorBidi" w:cstheme="majorBidi"/>
@@ -6711,6 +6339,7 @@
           <w:ilvl w:val="0"/>
           <w:numId w:val="11"/>
         </w:numPr>
+        <w:spacing w:after="80"/>
         <w:ind w:left="360"/>
         <w:jc w:val="both"/>
         <w:rPr>
@@ -6742,6 +6371,7 @@
     </w:p>
     <w:p>
       <w:pPr>
+        <w:spacing w:after="60"/>
         <w:jc w:val="both"/>
         <w:rPr>
           <w:rFonts w:asciiTheme="majorBidi" w:hAnsiTheme="majorBidi" w:cstheme="majorBidi"/>
@@ -6908,6 +6538,7 @@
           <w:ilvl w:val="0"/>
           <w:numId w:val="12"/>
         </w:numPr>
+        <w:spacing w:after="120"/>
         <w:ind w:left="360"/>
         <w:jc w:val="both"/>
         <w:rPr>
@@ -6927,7 +6558,6 @@
           <w:sz w:val="28"/>
           <w:szCs w:val="28"/>
         </w:rPr>
-        <w:lastRenderedPageBreak/>
         <w:t>kubectl</w:t>
       </w:r>
       <w:proofErr w:type="spellEnd"/>
@@ -6962,7 +6592,7 @@
     </w:p>
     <w:p>
       <w:pPr>
-        <w:spacing w:after="120"/>
+        <w:spacing w:after="60"/>
         <w:jc w:val="both"/>
         <w:rPr>
           <w:rFonts w:asciiTheme="majorBidi" w:hAnsiTheme="majorBidi" w:cstheme="majorBidi"/>
@@ -6995,6 +6625,7 @@
     </w:p>
     <w:p>
       <w:pPr>
+        <w:spacing w:after="60"/>
         <w:jc w:val="both"/>
         <w:rPr>
           <w:rFonts w:asciiTheme="majorBidi" w:hAnsiTheme="majorBidi" w:cstheme="majorBidi"/>
@@ -7352,6 +6983,7 @@
           <w:sz w:val="28"/>
           <w:szCs w:val="28"/>
         </w:rPr>
+        <w:lastRenderedPageBreak/>
         <w:t>kubectl</w:t>
       </w:r>
       <w:proofErr w:type="spellEnd"/>
@@ -7495,6 +7127,7 @@
     </w:p>
     <w:p>
       <w:pPr>
+        <w:spacing w:after="100"/>
         <w:jc w:val="both"/>
         <w:rPr>
           <w:rFonts w:asciiTheme="majorBidi" w:hAnsiTheme="majorBidi" w:cstheme="majorBidi"/>
@@ -7690,6 +7323,7 @@
     </w:p>
     <w:p>
       <w:pPr>
+        <w:spacing w:after="80"/>
         <w:jc w:val="both"/>
         <w:rPr>
           <w:rFonts w:asciiTheme="majorBidi" w:hAnsiTheme="majorBidi" w:cstheme="majorBidi"/>
@@ -7959,7 +7593,6 @@
           <w:szCs w:val="28"/>
           <w:u w:val="single"/>
         </w:rPr>
-        <w:lastRenderedPageBreak/>
         <w:t>Examples</w:t>
       </w:r>
       <w:r>
@@ -8465,6 +8098,7 @@
           <w:sz w:val="28"/>
           <w:szCs w:val="28"/>
         </w:rPr>
+        <w:lastRenderedPageBreak/>
         <w:t xml:space="preserve"> │   └─ </w:t>
       </w:r>
       <w:proofErr w:type="spellStart"/>
@@ -8617,6 +8251,7 @@
     </w:p>
     <w:p>
       <w:pPr>
+        <w:spacing w:after="80"/>
         <w:jc w:val="both"/>
         <w:rPr>
           <w:rFonts w:asciiTheme="majorBidi" w:hAnsiTheme="majorBidi" w:cstheme="majorBidi"/>
@@ -9081,7 +8716,6 @@
           <w:sz w:val="28"/>
           <w:szCs w:val="28"/>
         </w:rPr>
-        <w:lastRenderedPageBreak/>
         <w:t>kubectl</w:t>
       </w:r>
       <w:proofErr w:type="spellEnd"/>
@@ -9179,6 +8813,7 @@
           <w:ilvl w:val="0"/>
           <w:numId w:val="28"/>
         </w:numPr>
+        <w:spacing w:after="100"/>
         <w:ind w:left="360"/>
         <w:jc w:val="both"/>
         <w:rPr>
@@ -9300,6 +8935,7 @@
     </w:p>
     <w:p>
       <w:pPr>
+        <w:spacing w:after="80"/>
         <w:jc w:val="both"/>
         <w:rPr>
           <w:rFonts w:asciiTheme="majorBidi" w:hAnsiTheme="majorBidi" w:cstheme="majorBidi"/>
@@ -9332,6 +8968,7 @@
     </w:p>
     <w:p>
       <w:pPr>
+        <w:spacing w:after="60"/>
         <w:jc w:val="both"/>
         <w:rPr>
           <w:rFonts w:asciiTheme="majorBidi" w:hAnsiTheme="majorBidi" w:cstheme="majorBidi"/>
@@ -9370,6 +9007,7 @@
     </w:p>
     <w:p>
       <w:pPr>
+        <w:spacing w:after="100"/>
         <w:jc w:val="both"/>
         <w:rPr>
           <w:rFonts w:asciiTheme="majorBidi" w:hAnsiTheme="majorBidi" w:cstheme="majorBidi"/>
@@ -9452,6 +9090,7 @@
     </w:p>
     <w:p>
       <w:pPr>
+        <w:spacing w:after="60"/>
         <w:jc w:val="both"/>
         <w:rPr>
           <w:rFonts w:asciiTheme="majorBidi" w:hAnsiTheme="majorBidi" w:cstheme="majorBidi"/>
@@ -9559,12 +9198,17 @@
           <w:sz w:val="28"/>
           <w:szCs w:val="28"/>
         </w:rPr>
+        <w:lastRenderedPageBreak/>
         <w:t xml:space="preserve">When </w:t>
       </w:r>
       <w:proofErr w:type="spellStart"/>
       <w:r>
         <w:rPr>
           <w:rFonts w:asciiTheme="majorBidi" w:hAnsiTheme="majorBidi" w:cstheme="majorBidi"/>
+          <w:b/>
+          <w:bCs/>
+          <w:i/>
+          <w:iCs/>
           <w:sz w:val="28"/>
           <w:szCs w:val="28"/>
         </w:rPr>
@@ -9574,15 +9218,31 @@
       <w:r>
         <w:rPr>
           <w:rFonts w:asciiTheme="majorBidi" w:hAnsiTheme="majorBidi" w:cstheme="majorBidi"/>
-          <w:sz w:val="28"/>
-          <w:szCs w:val="28"/>
-        </w:rPr>
-        <w:t xml:space="preserve"> apply is executed, </w:t>
-      </w:r>
-      <w:proofErr w:type="spellStart"/>
-      <w:r>
-        <w:rPr>
-          <w:rFonts w:asciiTheme="majorBidi" w:hAnsiTheme="majorBidi" w:cstheme="majorBidi"/>
+          <w:b/>
+          <w:bCs/>
+          <w:i/>
+          <w:iCs/>
+          <w:sz w:val="28"/>
+          <w:szCs w:val="28"/>
+        </w:rPr>
+        <w:t xml:space="preserve"> apply</w:t>
+      </w:r>
+      <w:r>
+        <w:rPr>
+          <w:rFonts w:asciiTheme="majorBidi" w:hAnsiTheme="majorBidi" w:cstheme="majorBidi"/>
+          <w:sz w:val="28"/>
+          <w:szCs w:val="28"/>
+        </w:rPr>
+        <w:t xml:space="preserve"> is executed, </w:t>
+      </w:r>
+      <w:proofErr w:type="spellStart"/>
+      <w:r>
+        <w:rPr>
+          <w:rFonts w:asciiTheme="majorBidi" w:hAnsiTheme="majorBidi" w:cstheme="majorBidi"/>
+          <w:b/>
+          <w:bCs/>
+          <w:i/>
+          <w:iCs/>
           <w:sz w:val="28"/>
           <w:szCs w:val="28"/>
         </w:rPr>
@@ -9600,6 +9260,7 @@
     </w:p>
     <w:p>
       <w:pPr>
+        <w:spacing w:after="100"/>
         <w:jc w:val="both"/>
         <w:rPr>
           <w:rFonts w:asciiTheme="majorBidi" w:hAnsiTheme="majorBidi" w:cstheme="majorBidi"/>
@@ -9651,6 +9312,7 @@
     </w:p>
     <w:p>
       <w:pPr>
+        <w:spacing w:after="100"/>
         <w:jc w:val="both"/>
         <w:rPr>
           <w:rFonts w:asciiTheme="majorBidi" w:hAnsiTheme="majorBidi" w:cstheme="majorBidi"/>
@@ -9818,6 +9480,7 @@
           <w:ilvl w:val="0"/>
           <w:numId w:val="24"/>
         </w:numPr>
+        <w:spacing w:after="100"/>
         <w:ind w:left="360"/>
         <w:jc w:val="both"/>
         <w:rPr>
@@ -9968,7 +9631,6 @@
           <w:sz w:val="28"/>
           <w:szCs w:val="28"/>
         </w:rPr>
-        <w:lastRenderedPageBreak/>
         <w:t>A single YAML file may contain multiple resource definitions separated by ---</w:t>
       </w:r>
       <w:r>
@@ -10051,6 +9713,7 @@
     </w:p>
     <w:p>
       <w:pPr>
+        <w:spacing w:after="100"/>
         <w:jc w:val="both"/>
         <w:rPr>
           <w:rFonts w:asciiTheme="majorBidi" w:hAnsiTheme="majorBidi" w:cstheme="majorBidi"/>
@@ -10095,7 +9758,7 @@
     </w:p>
     <w:p>
       <w:pPr>
-        <w:spacing w:after="120"/>
+        <w:spacing w:after="80"/>
         <w:jc w:val="both"/>
         <w:rPr>
           <w:rFonts w:asciiTheme="majorBidi" w:hAnsiTheme="majorBidi" w:cstheme="majorBidi"/>
@@ -10282,6 +9945,7 @@
           <w:sz w:val="28"/>
           <w:szCs w:val="28"/>
         </w:rPr>
+        <w:lastRenderedPageBreak/>
         <w:t>Syntax</w:t>
       </w:r>
       <w:r>
@@ -10297,6 +9961,7 @@
     </w:p>
     <w:p>
       <w:pPr>
+        <w:spacing w:after="80"/>
         <w:jc w:val="both"/>
         <w:rPr>
           <w:rFonts w:asciiTheme="majorBidi" w:hAnsiTheme="majorBidi" w:cstheme="majorBidi"/>
@@ -10413,6 +10078,7 @@
           <w:ilvl w:val="0"/>
           <w:numId w:val="22"/>
         </w:numPr>
+        <w:spacing w:after="80"/>
         <w:ind w:left="360"/>
         <w:jc w:val="both"/>
         <w:rPr>
@@ -10624,6 +10290,7 @@
     </w:p>
     <w:p>
       <w:pPr>
+        <w:spacing w:after="100"/>
         <w:jc w:val="both"/>
         <w:rPr>
           <w:rFonts w:asciiTheme="majorBidi" w:hAnsiTheme="majorBidi" w:cstheme="majorBidi"/>
@@ -10682,7 +10349,6 @@
           <w:sz w:val="32"/>
           <w:szCs w:val="32"/>
         </w:rPr>
-        <w:lastRenderedPageBreak/>
         <w:t>Default Editor</w:t>
       </w:r>
       <w:r>
@@ -10698,7 +10364,7 @@
     </w:p>
     <w:p>
       <w:pPr>
-        <w:spacing w:after="120"/>
+        <w:spacing w:after="80"/>
         <w:jc w:val="both"/>
         <w:rPr>
           <w:rFonts w:asciiTheme="majorBidi" w:hAnsiTheme="majorBidi" w:cstheme="majorBidi"/>
@@ -10820,6 +10486,7 @@
           <w:ilvl w:val="0"/>
           <w:numId w:val="23"/>
         </w:numPr>
+        <w:spacing w:after="100"/>
         <w:ind w:left="360"/>
         <w:jc w:val="both"/>
         <w:rPr>
@@ -10899,7 +10566,7 @@
     </w:p>
     <w:p>
       <w:pPr>
-        <w:spacing w:after="120"/>
+        <w:spacing w:after="80"/>
         <w:jc w:val="both"/>
         <w:rPr>
           <w:rFonts w:asciiTheme="majorBidi" w:hAnsiTheme="majorBidi" w:cstheme="majorBidi"/>
@@ -10981,7 +10648,7 @@
     </w:p>
     <w:p>
       <w:pPr>
-        <w:spacing w:after="60"/>
+        <w:spacing w:after="40"/>
         <w:jc w:val="both"/>
         <w:rPr>
           <w:rFonts w:asciiTheme="majorBidi" w:hAnsiTheme="majorBidi" w:cstheme="majorBidi"/>
@@ -11044,6 +10711,7 @@
     </w:p>
     <w:p>
       <w:pPr>
+        <w:spacing w:after="80"/>
         <w:jc w:val="both"/>
         <w:rPr>
           <w:rFonts w:asciiTheme="majorBidi" w:hAnsiTheme="majorBidi" w:cstheme="majorBidi"/>
@@ -11160,6 +10828,7 @@
           <w:sz w:val="28"/>
           <w:szCs w:val="28"/>
         </w:rPr>
+        <w:lastRenderedPageBreak/>
         <w:t>kubectl</w:t>
       </w:r>
       <w:proofErr w:type="spellEnd"/>
@@ -11731,20 +11400,20 @@
     </w:p>
     <w:p>
       <w:pPr>
-        <w:jc w:val="both"/>
-        <w:rPr>
-          <w:rFonts w:asciiTheme="majorBidi" w:hAnsiTheme="majorBidi" w:cstheme="majorBidi"/>
-          <w:sz w:val="28"/>
-          <w:szCs w:val="28"/>
-        </w:rPr>
-      </w:pPr>
-      <w:r>
-        <w:rPr>
-          <w:rFonts w:asciiTheme="majorBidi" w:hAnsiTheme="majorBidi" w:cstheme="majorBidi"/>
-          <w:sz w:val="28"/>
-          <w:szCs w:val="28"/>
-        </w:rPr>
-        <w:lastRenderedPageBreak/>
+        <w:spacing w:after="100"/>
+        <w:jc w:val="both"/>
+        <w:rPr>
+          <w:rFonts w:asciiTheme="majorBidi" w:hAnsiTheme="majorBidi" w:cstheme="majorBidi"/>
+          <w:sz w:val="28"/>
+          <w:szCs w:val="28"/>
+        </w:rPr>
+      </w:pPr>
+      <w:r>
+        <w:rPr>
+          <w:rFonts w:asciiTheme="majorBidi" w:hAnsiTheme="majorBidi" w:cstheme="majorBidi"/>
+          <w:sz w:val="28"/>
+          <w:szCs w:val="28"/>
+        </w:rPr>
         <w:t xml:space="preserve">When </w:t>
       </w:r>
       <w:proofErr w:type="spellStart"/>
@@ -11804,6 +11473,7 @@
     </w:p>
     <w:p>
       <w:pPr>
+        <w:spacing w:after="60"/>
         <w:jc w:val="both"/>
         <w:rPr>
           <w:rFonts w:asciiTheme="majorBidi" w:hAnsiTheme="majorBidi" w:cstheme="majorBidi"/>
@@ -12438,96 +12108,7 @@
     </w:p>
     <w:p>
       <w:pPr>
-        <w:jc w:val="both"/>
-        <w:rPr>
-          <w:rFonts w:asciiTheme="majorBidi" w:hAnsiTheme="majorBidi" w:cstheme="majorBidi"/>
-          <w:sz w:val="28"/>
-          <w:szCs w:val="28"/>
-        </w:rPr>
-      </w:pPr>
-    </w:p>
-    <w:p>
-      <w:pPr>
-        <w:jc w:val="both"/>
-        <w:rPr>
-          <w:rFonts w:asciiTheme="majorBidi" w:hAnsiTheme="majorBidi" w:cstheme="majorBidi"/>
-          <w:sz w:val="28"/>
-          <w:szCs w:val="28"/>
-        </w:rPr>
-      </w:pPr>
-    </w:p>
-    <w:p>
-      <w:pPr>
-        <w:jc w:val="both"/>
-        <w:rPr>
-          <w:rFonts w:asciiTheme="majorBidi" w:hAnsiTheme="majorBidi" w:cstheme="majorBidi"/>
-          <w:sz w:val="28"/>
-          <w:szCs w:val="28"/>
-        </w:rPr>
-      </w:pPr>
-    </w:p>
-    <w:p>
-      <w:pPr>
-        <w:jc w:val="both"/>
-        <w:rPr>
-          <w:rFonts w:asciiTheme="majorBidi" w:hAnsiTheme="majorBidi" w:cstheme="majorBidi"/>
-          <w:sz w:val="28"/>
-          <w:szCs w:val="28"/>
-        </w:rPr>
-      </w:pPr>
-    </w:p>
-    <w:p>
-      <w:pPr>
-        <w:jc w:val="both"/>
-        <w:rPr>
-          <w:rFonts w:asciiTheme="majorBidi" w:hAnsiTheme="majorBidi" w:cstheme="majorBidi"/>
-          <w:sz w:val="28"/>
-          <w:szCs w:val="28"/>
-        </w:rPr>
-      </w:pPr>
-    </w:p>
-    <w:p>
-      <w:pPr>
-        <w:jc w:val="both"/>
-        <w:rPr>
-          <w:rFonts w:asciiTheme="majorBidi" w:hAnsiTheme="majorBidi" w:cstheme="majorBidi"/>
-          <w:sz w:val="28"/>
-          <w:szCs w:val="28"/>
-        </w:rPr>
-      </w:pPr>
-    </w:p>
-    <w:p>
-      <w:pPr>
-        <w:jc w:val="both"/>
-        <w:rPr>
-          <w:rFonts w:asciiTheme="majorBidi" w:hAnsiTheme="majorBidi" w:cstheme="majorBidi"/>
-          <w:sz w:val="28"/>
-          <w:szCs w:val="28"/>
-        </w:rPr>
-      </w:pPr>
-    </w:p>
-    <w:p>
-      <w:pPr>
-        <w:jc w:val="both"/>
-        <w:rPr>
-          <w:rFonts w:asciiTheme="majorBidi" w:hAnsiTheme="majorBidi" w:cstheme="majorBidi"/>
-          <w:sz w:val="28"/>
-          <w:szCs w:val="28"/>
-        </w:rPr>
-      </w:pPr>
-    </w:p>
-    <w:p>
-      <w:pPr>
-        <w:jc w:val="both"/>
-        <w:rPr>
-          <w:rFonts w:asciiTheme="majorBidi" w:hAnsiTheme="majorBidi" w:cstheme="majorBidi"/>
-          <w:sz w:val="28"/>
-          <w:szCs w:val="28"/>
-        </w:rPr>
-      </w:pPr>
-    </w:p>
-    <w:p>
-      <w:pPr>
+        <w:spacing w:after="0"/>
         <w:jc w:val="both"/>
         <w:rPr>
           <w:rFonts w:asciiTheme="majorBidi" w:hAnsiTheme="majorBidi" w:cstheme="majorBidi"/>
@@ -12547,6 +12128,7 @@
     </w:p>
     <w:p>
       <w:pPr>
+        <w:spacing w:after="0"/>
         <w:jc w:val="both"/>
         <w:rPr>
           <w:rFonts w:asciiTheme="majorBidi" w:hAnsiTheme="majorBidi" w:cstheme="majorBidi"/>
@@ -12578,6 +12160,7 @@
     </w:p>
     <w:p>
       <w:pPr>
+        <w:spacing w:after="0"/>
         <w:jc w:val="both"/>
         <w:rPr>
           <w:rFonts w:asciiTheme="majorBidi" w:hAnsiTheme="majorBidi" w:cstheme="majorBidi"/>
@@ -12608,6 +12191,7 @@
     </w:p>
     <w:p>
       <w:pPr>
+        <w:spacing w:after="0"/>
         <w:jc w:val="both"/>
         <w:rPr>
           <w:rFonts w:asciiTheme="majorBidi" w:hAnsiTheme="majorBidi" w:cstheme="majorBidi"/>
@@ -12638,6 +12222,7 @@
     </w:p>
     <w:p>
       <w:pPr>
+        <w:spacing w:after="0"/>
         <w:jc w:val="both"/>
         <w:rPr>
           <w:rFonts w:asciiTheme="majorBidi" w:hAnsiTheme="majorBidi" w:cstheme="majorBidi"/>
@@ -12656,6 +12241,7 @@
     </w:p>
     <w:p>
       <w:pPr>
+        <w:spacing w:after="0"/>
         <w:jc w:val="both"/>
         <w:rPr>
           <w:rFonts w:asciiTheme="majorBidi" w:hAnsiTheme="majorBidi" w:cstheme="majorBidi"/>
@@ -12686,6 +12272,7 @@
     </w:p>
     <w:p>
       <w:pPr>
+        <w:spacing w:after="0"/>
         <w:jc w:val="both"/>
         <w:rPr>
           <w:rFonts w:asciiTheme="majorBidi" w:hAnsiTheme="majorBidi" w:cstheme="majorBidi"/>
@@ -12716,6 +12303,7 @@
     </w:p>
     <w:p>
       <w:pPr>
+        <w:spacing w:after="0"/>
         <w:jc w:val="both"/>
         <w:rPr>
           <w:rFonts w:asciiTheme="majorBidi" w:hAnsiTheme="majorBidi" w:cstheme="majorBidi"/>
@@ -12734,6 +12322,7 @@
     </w:p>
     <w:p>
       <w:pPr>
+        <w:spacing w:after="0"/>
         <w:jc w:val="both"/>
         <w:rPr>
           <w:rFonts w:asciiTheme="majorBidi" w:hAnsiTheme="majorBidi" w:cstheme="majorBidi"/>
@@ -12764,6 +12353,7 @@
     </w:p>
     <w:p>
       <w:pPr>
+        <w:spacing w:after="0"/>
         <w:jc w:val="both"/>
         <w:rPr>
           <w:rFonts w:asciiTheme="majorBidi" w:hAnsiTheme="majorBidi" w:cstheme="majorBidi"/>
@@ -12792,6 +12382,7 @@
     </w:p>
     <w:p>
       <w:pPr>
+        <w:spacing w:after="0"/>
         <w:jc w:val="both"/>
         <w:rPr>
           <w:rFonts w:asciiTheme="majorBidi" w:hAnsiTheme="majorBidi" w:cstheme="majorBidi"/>
@@ -12820,6 +12411,7 @@
     </w:p>
     <w:p>
       <w:pPr>
+        <w:spacing w:after="0"/>
         <w:jc w:val="both"/>
         <w:rPr>
           <w:rFonts w:asciiTheme="majorBidi" w:hAnsiTheme="majorBidi" w:cstheme="majorBidi"/>
@@ -12838,6 +12430,7 @@
     </w:p>
     <w:p>
       <w:pPr>
+        <w:spacing w:after="0"/>
         <w:jc w:val="both"/>
         <w:rPr>
           <w:rFonts w:asciiTheme="majorBidi" w:hAnsiTheme="majorBidi" w:cstheme="majorBidi"/>
@@ -12866,6 +12459,7 @@
     </w:p>
     <w:p>
       <w:pPr>
+        <w:spacing w:after="0"/>
         <w:jc w:val="both"/>
         <w:rPr>
           <w:rFonts w:asciiTheme="majorBidi" w:hAnsiTheme="majorBidi" w:cstheme="majorBidi"/>
@@ -12884,16 +12478,18 @@
     </w:p>
     <w:p>
       <w:pPr>
-        <w:jc w:val="both"/>
-        <w:rPr>
-          <w:rFonts w:asciiTheme="majorBidi" w:hAnsiTheme="majorBidi" w:cstheme="majorBidi"/>
-          <w:sz w:val="28"/>
-          <w:szCs w:val="28"/>
-        </w:rPr>
-      </w:pPr>
-    </w:p>
-    <w:p>
-      <w:pPr>
+        <w:spacing w:after="0"/>
+        <w:jc w:val="both"/>
+        <w:rPr>
+          <w:rFonts w:asciiTheme="majorBidi" w:hAnsiTheme="majorBidi" w:cstheme="majorBidi"/>
+          <w:sz w:val="28"/>
+          <w:szCs w:val="28"/>
+        </w:rPr>
+      </w:pPr>
+    </w:p>
+    <w:p>
+      <w:pPr>
+        <w:spacing w:after="0"/>
         <w:jc w:val="both"/>
         <w:rPr>
           <w:rFonts w:asciiTheme="majorBidi" w:hAnsiTheme="majorBidi" w:cstheme="majorBidi"/>
@@ -12925,6 +12521,7 @@
     </w:p>
     <w:p>
       <w:pPr>
+        <w:spacing w:after="0"/>
         <w:jc w:val="both"/>
         <w:rPr>
           <w:rFonts w:asciiTheme="majorBidi" w:hAnsiTheme="majorBidi" w:cstheme="majorBidi"/>
@@ -12955,6 +12552,7 @@
     </w:p>
     <w:p>
       <w:pPr>
+        <w:spacing w:after="0"/>
         <w:jc w:val="both"/>
         <w:rPr>
           <w:rFonts w:asciiTheme="majorBidi" w:hAnsiTheme="majorBidi" w:cstheme="majorBidi"/>
@@ -12983,6 +12581,7 @@
     </w:p>
     <w:p>
       <w:pPr>
+        <w:spacing w:after="0"/>
         <w:jc w:val="both"/>
         <w:rPr>
           <w:rFonts w:asciiTheme="majorBidi" w:hAnsiTheme="majorBidi" w:cstheme="majorBidi"/>
@@ -13001,16 +12600,18 @@
     </w:p>
     <w:p>
       <w:pPr>
-        <w:jc w:val="both"/>
-        <w:rPr>
-          <w:rFonts w:asciiTheme="majorBidi" w:hAnsiTheme="majorBidi" w:cstheme="majorBidi"/>
-          <w:sz w:val="28"/>
-          <w:szCs w:val="28"/>
-        </w:rPr>
-      </w:pPr>
-    </w:p>
-    <w:p>
-      <w:pPr>
+        <w:spacing w:after="0"/>
+        <w:jc w:val="both"/>
+        <w:rPr>
+          <w:rFonts w:asciiTheme="majorBidi" w:hAnsiTheme="majorBidi" w:cstheme="majorBidi"/>
+          <w:sz w:val="28"/>
+          <w:szCs w:val="28"/>
+        </w:rPr>
+      </w:pPr>
+    </w:p>
+    <w:p>
+      <w:pPr>
+        <w:spacing w:after="0"/>
         <w:jc w:val="both"/>
         <w:rPr>
           <w:rFonts w:asciiTheme="majorBidi" w:hAnsiTheme="majorBidi" w:cstheme="majorBidi"/>
@@ -13039,6 +12640,7 @@
     </w:p>
     <w:p>
       <w:pPr>
+        <w:spacing w:after="0"/>
         <w:jc w:val="both"/>
         <w:rPr>
           <w:rFonts w:asciiTheme="majorBidi" w:hAnsiTheme="majorBidi" w:cstheme="majorBidi"/>

</xml_diff>